<commit_message>
docs: rewrite widget documentation as user-facing wiki instructions
Replaces technical parameter tables with step-by-step user instructions
matching the actual settings panel UI in Russian, following the vendor
wiki format (sections per UI panel, numbered steps, screenshot markers).

https://claude.ai/code/session_016ergPRPrTE8jUA77A8m7R3
</commit_message>
<xml_diff>
--- a/2.1/docs/ElemAutoLogout.docx
+++ b/2.1/docs/ElemAutoLogout.docx
@@ -3,54 +3,272 @@
 <w:document xmlns:wpc="http://schemas.microsoft.com/office/word/2010/wordprocessingCanvas" xmlns:mo="http://schemas.microsoft.com/office/mac/office/2008/main" xmlns:mc="http://schemas.openxmlformats.org/markup-compatibility/2006" xmlns:mv="urn:schemas-microsoft-com:mac:vml" xmlns:o="urn:schemas-microsoft-com:office:office" xmlns:r="http://schemas.openxmlformats.org/officeDocument/2006/relationships" xmlns:m="http://schemas.openxmlformats.org/officeDocument/2006/math" xmlns:v="urn:schemas-microsoft-com:vml" xmlns:wp14="http://schemas.microsoft.com/office/word/2010/wordprocessingDrawing" xmlns:wp="http://schemas.openxmlformats.org/drawingml/2006/wordprocessingDrawing" xmlns:w10="urn:schemas-microsoft-com:office:word" xmlns:w="http://schemas.openxmlformats.org/wordprocessingml/2006/main" xmlns:w14="http://schemas.microsoft.com/office/word/2010/wordml" xmlns:wpg="http://schemas.microsoft.com/office/word/2010/wordprocessingGroup" xmlns:wpi="http://schemas.microsoft.com/office/word/2010/wordprocessingInk" xmlns:wne="http://schemas.microsoft.com/office/word/2006/wordml" xmlns:wps="http://schemas.microsoft.com/office/word/2010/wordprocessingShape" mc:Ignorable="w14 wp14">
   <w:body>
     <w:p>
+      <w:r>
+        <w:rPr>
+          <w:b/>
+          <w:color w:val="4F6AFF"/>
+          <w:sz w:val="56"/>
+        </w:rPr>
+        <w:t>Виджет «Авто-выход»</w:t>
+      </w:r>
+    </w:p>
+    <w:p>
+      <w:r>
+        <w:rPr>
+          <w:color w:val="64748B"/>
+          <w:sz w:val="24"/>
+        </w:rPr>
+        <w:t>ElemAutoLogout — автоматический выход при бездействии пользователя</w:t>
+      </w:r>
+    </w:p>
+    <w:p/>
+    <w:p>
       <w:pPr>
-        <w:jc w:val="left"/>
+        <w:spacing w:before="200" w:after="40"/>
       </w:pPr>
       <w:r>
         <w:rPr>
           <w:b/>
           <w:color w:val="4F6AFF"/>
-          <w:sz w:val="52"/>
+          <w:sz w:val="28"/>
         </w:rPr>
-        <w:t>ElemAutoLogout</w:t>
+        <w:t>Описание</w:t>
       </w:r>
     </w:p>
     <w:p>
+      <w:pPr>
+        <w:spacing w:after="40"/>
+      </w:pPr>
       <w:r>
         <w:rPr>
-          <w:color w:val="475569"/>
-          <w:sz w:val="24"/>
+          <w:sz w:val="21"/>
         </w:rPr>
-        <w:t>Виджет автоматического выхода при бездействии пользователя</w:t>
+        <w:t>Виджет «Авто-выход» отслеживает активность пользователя на странице. Если пользователь не совершал никаких действий в течение заданного времени — виджет показывает предупреждающий диалог с обратным отсчётом. Если пользователь не нажал «Оставаться в системе» — выполняется выход из системы. Опционально можно запомнить адрес страницы, чтобы вернуть пользователя на неё после повторного входа.</w:t>
+      </w:r>
+    </w:p>
+    <w:tbl>
+      <w:tblPr>
+        <w:tblW w:type="auto" w:w="0"/>
+        <w:tblLook w:firstColumn="1" w:firstRow="1" w:lastColumn="0" w:lastRow="0" w:noHBand="0" w:noVBand="1" w:val="04A0"/>
+      </w:tblPr>
+      <w:tblGrid>
+        <w:gridCol w:w="9406"/>
+      </w:tblGrid>
+      <w:tr>
+        <w:tc>
+          <w:tcPr>
+            <w:tcW w:type="dxa" w:w="9406"/>
+            <w:shd w:val="clear" w:color="auto" w:fill="EEF1FF"/>
+          </w:tcPr>
+          <w:p>
+            <w:pPr>
+              <w:spacing w:before="80" w:after="80"/>
+              <w:ind w:left="170" w:right="170"/>
+            </w:pPr>
+            <w:r>
+              <w:rPr>
+                <w:i/>
+                <w:color w:val="3D55E8"/>
+                <w:sz w:val="20"/>
+              </w:rPr>
+              <w:t>Виджет работает только в рантайме. В конструкторе (редакторе) отображается информационный плейсхолдер — таймер не запускается. Редирект после выхода управляется виджетом «Авторизационный контейнер».</w:t>
+            </w:r>
+          </w:p>
+        </w:tc>
+      </w:tr>
+    </w:tbl>
+    <w:p/>
+    <w:p>
+      <w:pPr>
+        <w:spacing w:before="80"/>
+      </w:pPr>
+      <w:r>
+        <w:rPr>
+          <w:i/>
+          <w:color w:val="64748B"/>
+          <w:sz w:val="18"/>
+        </w:rPr>
+        <w:t>[Скриншот: Плейсхолдер виджета в редакторе]</w:t>
       </w:r>
     </w:p>
     <w:p/>
     <w:p>
+      <w:pPr>
+        <w:spacing w:before="200" w:after="40"/>
+      </w:pPr>
       <w:r>
         <w:rPr>
           <w:b/>
           <w:color w:val="4F6AFF"/>
-          <w:sz w:val="26"/>
+          <w:sz w:val="28"/>
         </w:rPr>
-        <w:t>Назначение</w:t>
+        <w:t>Настройка таймаута бездействия</w:t>
       </w:r>
     </w:p>
     <w:p>
+      <w:pPr>
+        <w:pStyle w:val="ListNumber"/>
+      </w:pPr>
       <w:r>
         <w:rPr>
-          <w:sz w:val="20"/>
+          <w:sz w:val="21"/>
         </w:rPr>
-        <w:t>ElemAutoLogout отслеживает активность пользователя (движение мыши, клики, нажатия клавиш, прокрутка). При превышении таймаута бездействия показывает предупреждающий диалог с обратным отсчётом. Если пользователь не реагирует — выполняется выход из системы через AuthManager платформы. Опционально сохраняет URL текущей страницы в sessionStorage для возврата после входа.</w:t>
+        <w:t>В разделе «Время бездействия» задайте значение в поле «Таймаут до выхода».</w:t>
       </w:r>
     </w:p>
     <w:p>
+      <w:pPr>
+        <w:pStyle w:val="ListNumber"/>
+      </w:pPr>
+      <w:r>
+        <w:rPr>
+          <w:sz w:val="21"/>
+        </w:rPr>
+        <w:t>Выберите единицу измерения: сек / мин / час.</w:t>
+      </w:r>
+    </w:p>
+    <w:p>
+      <w:pPr>
+        <w:spacing w:after="40"/>
+      </w:pPr>
+      <w:r>
+        <w:rPr>
+          <w:sz w:val="21"/>
+        </w:rPr>
+        <w:t>По умолчанию таймаут составляет 1800 секунд (30 минут).</w:t>
+      </w:r>
+    </w:p>
+    <w:p>
+      <w:pPr>
+        <w:spacing w:before="80"/>
+      </w:pPr>
+      <w:r>
+        <w:rPr>
+          <w:i/>
+          <w:color w:val="64748B"/>
+          <w:sz w:val="18"/>
+        </w:rPr>
+        <w:t>[Скриншот: Настройка таймаута бездействия]</w:t>
+      </w:r>
+    </w:p>
+    <w:p/>
+    <w:p>
+      <w:pPr>
+        <w:spacing w:before="200" w:after="40"/>
+      </w:pPr>
       <w:r>
         <w:rPr>
           <w:b/>
           <w:color w:val="4F6AFF"/>
-          <w:sz w:val="26"/>
+          <w:sz w:val="28"/>
         </w:rPr>
-        <w:t>Механизм работы</w:t>
+        <w:t>Настройка предупреждения</w:t>
+      </w:r>
+    </w:p>
+    <w:p>
+      <w:pPr>
+        <w:spacing w:after="40"/>
+      </w:pPr>
+      <w:r>
+        <w:rPr>
+          <w:sz w:val="21"/>
+        </w:rPr>
+        <w:t>Перед выходом виджет может показать диалоговое окно с обратным отсчётом, давая пользователю возможность продолжить сессию.</w:t>
+      </w:r>
+    </w:p>
+    <w:p>
+      <w:pPr>
+        <w:pStyle w:val="ListNumber"/>
+      </w:pPr>
+      <w:r>
+        <w:rPr>
+          <w:sz w:val="21"/>
+        </w:rPr>
+        <w:t>Активируйте переключатель «Показывать предупреждение».</w:t>
+      </w:r>
+    </w:p>
+    <w:p>
+      <w:pPr>
+        <w:pStyle w:val="ListNumber"/>
+      </w:pPr>
+      <w:r>
+        <w:rPr>
+          <w:sz w:val="21"/>
+        </w:rPr>
+        <w:t>Задайте значение и единицу измерения в поле «Длительность» — столько времени будет показываться диалог до автоматического выхода.</w:t>
+      </w:r>
+    </w:p>
+    <w:p>
+      <w:pPr>
+        <w:spacing w:after="40"/>
+      </w:pPr>
+      <w:r>
+        <w:rPr>
+          <w:sz w:val="21"/>
+        </w:rPr>
+        <w:t>На временно́й шкале ниже наглядно показана последовательность: бездействие → предупреждение → выход.</w:t>
+      </w:r>
+    </w:p>
+    <w:p>
+      <w:pPr>
+        <w:spacing w:before="80"/>
+      </w:pPr>
+      <w:r>
+        <w:rPr>
+          <w:i/>
+          <w:color w:val="64748B"/>
+          <w:sz w:val="18"/>
+        </w:rPr>
+        <w:t>[Скриншот: Настройка предупреждения перед выходом]</w:t>
+      </w:r>
+    </w:p>
+    <w:p/>
+    <w:p>
+      <w:pPr>
+        <w:spacing w:before="200" w:after="40"/>
+      </w:pPr>
+      <w:r>
+        <w:rPr>
+          <w:b/>
+          <w:color w:val="4F6AFF"/>
+          <w:sz w:val="28"/>
+        </w:rPr>
+        <w:t>Возврат на страницу после входа</w:t>
+      </w:r>
+    </w:p>
+    <w:p>
+      <w:pPr>
+        <w:spacing w:after="40"/>
+      </w:pPr>
+      <w:r>
+        <w:rPr>
+          <w:sz w:val="21"/>
+        </w:rPr>
+        <w:t>Активируйте «Запомнить страницу и вернуться после входа» — виджет сохранит URL текущей страницы в sessionStorage браузера. После повторной авторизации пользователь вернётся на ту же страницу.</w:t>
+      </w:r>
+    </w:p>
+    <w:p>
+      <w:pPr>
+        <w:spacing w:before="200" w:after="40"/>
+      </w:pPr>
+      <w:r>
+        <w:rPr>
+          <w:b/>
+          <w:color w:val="4F6AFF"/>
+          <w:sz w:val="28"/>
+        </w:rPr>
+        <w:t>Тексты интерфейса</w:t>
+      </w:r>
+    </w:p>
+    <w:p>
+      <w:pPr>
+        <w:spacing w:after="40"/>
+      </w:pPr>
+      <w:r>
+        <w:rPr>
+          <w:sz w:val="21"/>
+        </w:rPr>
+        <w:t>Разверните блок «Тексты интерфейса» чтобы изменить стандартные подписи:</w:t>
       </w:r>
     </w:p>
     <w:p>
@@ -59,9 +277,9 @@
       </w:pPr>
       <w:r>
         <w:rPr>
-          <w:sz w:val="20"/>
+          <w:sz w:val="21"/>
         </w:rPr>
-        <w:t>Старт: отслеживание активности начинается при монтировании виджета</w:t>
+        <w:t>Заголовок диалога (по умолчанию: «Сессия истекает»).</w:t>
       </w:r>
     </w:p>
     <w:p>
@@ -70,9 +288,9 @@
       </w:pPr>
       <w:r>
         <w:rPr>
-          <w:sz w:val="20"/>
+          <w:sz w:val="21"/>
         </w:rPr>
-        <w:t>Сброс: любое действие пользователя обнуляет таймер бездействия</w:t>
+        <w:t>Сообщение (по умолчанию: «Вы будете автоматически выведены из системы через»).</w:t>
       </w:r>
     </w:p>
     <w:p>
@@ -81,9 +299,9 @@
       </w:pPr>
       <w:r>
         <w:rPr>
-          <w:sz w:val="20"/>
+          <w:sz w:val="21"/>
         </w:rPr>
-        <w:t>Предупреждение: за N секунд до выхода появляется диалог с обратным отсчётом</w:t>
+        <w:t>Текст кнопки (по умолчанию: «Оставаться в системе»).</w:t>
       </w:r>
     </w:p>
     <w:p>
@@ -92,9 +310,95 @@
       </w:pPr>
       <w:r>
         <w:rPr>
-          <w:sz w:val="20"/>
+          <w:sz w:val="21"/>
         </w:rPr>
-        <w:t>Кнопка «Оставаться в системе»: скрывает диалог и сбрасывает таймер</w:t>
+        <w:t>Суффикс единицы времени (по умолчанию: «сек.»).</w:t>
+      </w:r>
+    </w:p>
+    <w:p>
+      <w:pPr>
+        <w:spacing w:before="80"/>
+      </w:pPr>
+      <w:r>
+        <w:rPr>
+          <w:i/>
+          <w:color w:val="64748B"/>
+          <w:sz w:val="18"/>
+        </w:rPr>
+        <w:t>[Скриншот: Настройка текстов интерфейса]</w:t>
+      </w:r>
+    </w:p>
+    <w:p/>
+    <w:p>
+      <w:pPr>
+        <w:spacing w:before="200" w:after="40"/>
+      </w:pPr>
+      <w:r>
+        <w:rPr>
+          <w:b/>
+          <w:color w:val="4F6AFF"/>
+          <w:sz w:val="28"/>
+        </w:rPr>
+        <w:t>Оформление диалога (вкладка «Оформление»)</w:t>
+      </w:r>
+    </w:p>
+    <w:p>
+      <w:pPr>
+        <w:spacing w:after="40"/>
+      </w:pPr>
+      <w:r>
+        <w:rPr>
+          <w:sz w:val="21"/>
+        </w:rPr>
+        <w:t>Вверху панели расположен живой превью — диалог обновляется в реальном времени при изменении настроек.</w:t>
+      </w:r>
+    </w:p>
+    <w:p>
+      <w:pPr>
+        <w:spacing w:before="120" w:after="20"/>
+      </w:pPr>
+      <w:r>
+        <w:rPr>
+          <w:b/>
+          <w:color w:val="1E293B"/>
+          <w:sz w:val="23"/>
+        </w:rPr>
+        <w:t>Пресеты</w:t>
+      </w:r>
+    </w:p>
+    <w:p>
+      <w:pPr>
+        <w:spacing w:after="40"/>
+      </w:pPr>
+      <w:r>
+        <w:rPr>
+          <w:sz w:val="21"/>
+        </w:rPr>
+        <w:t>Выберите готовую тему оформления: По умолчанию, Тёмная, Опасность, Мягкая.</w:t>
+      </w:r>
+    </w:p>
+    <w:p>
+      <w:pPr>
+        <w:spacing w:after="40"/>
+      </w:pPr>
+      <w:r>
+        <w:rPr>
+          <w:sz w:val="21"/>
+        </w:rPr>
+        <w:t>Для кнопки «Оставаться в системе» доступны цветовые пресеты: Синий, Фиолетовый, Голубой, Зелёный, Янтарный, Красный, Розовый и др.</w:t>
+      </w:r>
+    </w:p>
+    <w:p>
+      <w:pPr>
+        <w:spacing w:before="120" w:after="20"/>
+      </w:pPr>
+      <w:r>
+        <w:rPr>
+          <w:b/>
+          <w:color w:val="1E293B"/>
+          <w:sz w:val="23"/>
+        </w:rPr>
+        <w:t>Настройки кнопки</w:t>
       </w:r>
     </w:p>
     <w:p>
@@ -103,9 +407,9 @@
       </w:pPr>
       <w:r>
         <w:rPr>
-          <w:sz w:val="20"/>
+          <w:sz w:val="21"/>
         </w:rPr>
-        <w:t>Выход: вызывается AuthManager.logout() платформы</w:t>
+        <w:t>Фон кнопки и цвет текста.</w:t>
       </w:r>
     </w:p>
     <w:p>
@@ -114,3497 +418,138 @@
       </w:pPr>
       <w:r>
         <w:rPr>
-          <w:sz w:val="20"/>
+          <w:sz w:val="21"/>
         </w:rPr>
-        <w:t>Сохранение URL: при preserveReturnUrl=true текущий адрес сохраняется в sessionStorage</w:t>
+        <w:t>Гарнитура шрифта (или выбор из готовых: Inter, Roboto, Montserrat и др.).</w:t>
       </w:r>
     </w:p>
     <w:p>
       <w:pPr>
-        <w:ind w:left="283"/>
+        <w:pStyle w:val="ListBullet"/>
+      </w:pPr>
+      <w:r>
+        <w:rPr>
+          <w:sz w:val="21"/>
+        </w:rPr>
+        <w:t>Регистр текста: Обычный / ЗАГЛАВНЫЕ / Первые заглавные / строчные.</w:t>
+      </w:r>
+    </w:p>
+    <w:p>
+      <w:pPr>
+        <w:pStyle w:val="ListBullet"/>
+      </w:pPr>
+      <w:r>
+        <w:rPr>
+          <w:sz w:val="21"/>
+        </w:rPr>
+        <w:t>Межбуквенный интервал (ползунок).</w:t>
+      </w:r>
+    </w:p>
+    <w:p>
+      <w:pPr>
+        <w:pStyle w:val="ListBullet"/>
+      </w:pPr>
+      <w:r>
+        <w:rPr>
+          <w:sz w:val="21"/>
+        </w:rPr>
+        <w:t>Скругление кнопки: пресеты (Острые / Мягкие / Круглые / Пилюля) или ползунок.</w:t>
+      </w:r>
+    </w:p>
+    <w:p>
+      <w:pPr>
+        <w:spacing w:before="120" w:after="20"/>
+      </w:pPr>
+      <w:r>
+        <w:rPr>
+          <w:b/>
+          <w:color w:val="1E293B"/>
+          <w:sz w:val="23"/>
+        </w:rPr>
+        <w:t>Настройки окна</w:t>
+      </w:r>
+    </w:p>
+    <w:p>
+      <w:pPr>
+        <w:pStyle w:val="ListBullet"/>
+      </w:pPr>
+      <w:r>
+        <w:rPr>
+          <w:sz w:val="21"/>
+        </w:rPr>
+        <w:t>Фон, цвет текста, цвет иконки диалогового окна.</w:t>
+      </w:r>
+    </w:p>
+    <w:p>
+      <w:pPr>
+        <w:pStyle w:val="ListBullet"/>
+      </w:pPr>
+      <w:r>
+        <w:rPr>
+          <w:sz w:val="21"/>
+        </w:rPr>
+        <w:t>Скругление окна предупреждения.</w:t>
+      </w:r>
+    </w:p>
+    <w:p>
+      <w:pPr>
+        <w:pStyle w:val="ListBullet"/>
+      </w:pPr>
+      <w:r>
+        <w:rPr>
+          <w:sz w:val="21"/>
+        </w:rPr>
+        <w:t>Размер (максимальная ширина) окна.</w:t>
+      </w:r>
+    </w:p>
+    <w:p>
+      <w:pPr>
+        <w:spacing w:before="120" w:after="20"/>
+      </w:pPr>
+      <w:r>
+        <w:rPr>
+          <w:b/>
+          <w:color w:val="1E293B"/>
+          <w:sz w:val="23"/>
+        </w:rPr>
+        <w:t>Подложка (overlay)</w:t>
+      </w:r>
+    </w:p>
+    <w:p>
+      <w:pPr>
+        <w:pStyle w:val="ListBullet"/>
+      </w:pPr>
+      <w:r>
+        <w:rPr>
+          <w:sz w:val="21"/>
+        </w:rPr>
+        <w:t>Цвет подложки.</w:t>
+      </w:r>
+    </w:p>
+    <w:p>
+      <w:pPr>
+        <w:pStyle w:val="ListBullet"/>
+      </w:pPr>
+      <w:r>
+        <w:rPr>
+          <w:sz w:val="21"/>
+        </w:rPr>
+        <w:t>Непрозрачность подложки (ползунок в процентах).</w:t>
+      </w:r>
+    </w:p>
+    <w:p>
+      <w:pPr>
+        <w:spacing w:before="80"/>
       </w:pPr>
       <w:r>
         <w:rPr>
           <w:i/>
-          <w:color w:val="475569"/>
+          <w:color w:val="64748B"/>
           <w:sz w:val="18"/>
         </w:rPr>
-        <w:t xml:space="preserve">  ℹ  В режиме редактора (конструктора) трекинг не активируется — виджет показывает информационный плейсхолдер.</w:t>
+        <w:t>[Скриншот: Настройка оформления диалога авто-выхода]</w:t>
       </w:r>
     </w:p>
-    <w:p>
-      <w:r>
-        <w:rPr>
-          <w:b/>
-          <w:color w:val="4F6AFF"/>
-          <w:sz w:val="26"/>
-        </w:rPr>
-        <w:t>Параметры</w:t>
-      </w:r>
-    </w:p>
-    <w:p>
-      <w:r>
-        <w:rPr>
-          <w:b/>
-          <w:color w:val="1E293B"/>
-          <w:sz w:val="22"/>
-        </w:rPr>
-        <w:t>Таймауты</w:t>
-      </w:r>
-    </w:p>
-    <w:tbl>
-      <w:tblPr>
-        <w:tblW w:type="auto" w:w="0"/>
-        <w:jc w:val="left"/>
-        <w:tblLook w:firstColumn="1" w:firstRow="1" w:lastColumn="0" w:lastRow="0" w:noHBand="0" w:noVBand="1" w:val="04A0"/>
-      </w:tblPr>
-      <w:tblGrid>
-        <w:gridCol w:w="2351"/>
-        <w:gridCol w:w="2351"/>
-        <w:gridCol w:w="2351"/>
-        <w:gridCol w:w="2351"/>
-      </w:tblGrid>
-      <w:tr>
-        <w:tc>
-          <w:tcPr>
-            <w:tcW w:type="dxa" w:w="2551"/>
-            <w:shd w:val="clear" w:color="auto" w:fill="4F6AFF"/>
-            <w:tcBorders>
-              <w:top w:val="single" w:sz="4" w:color="3A56F0"/>
-              <w:left w:val="single" w:sz="4" w:color="3A56F0"/>
-              <w:bottom w:val="single" w:sz="4" w:color="3A56F0"/>
-              <w:right w:val="single" w:sz="4" w:color="3A56F0"/>
-              <w:insideH w:val="single" w:sz="4" w:color="3A56F0"/>
-              <w:insideV w:val="single" w:sz="4" w:color="3A56F0"/>
-            </w:tcBorders>
-          </w:tcPr>
-          <w:p>
-            <w:pPr>
-              <w:jc w:val="left"/>
-            </w:pPr>
-            <w:r>
-              <w:rPr>
-                <w:b/>
-                <w:color w:val="FFFFFF"/>
-                <w:sz w:val="18"/>
-              </w:rPr>
-              <w:t>Параметр</w:t>
-            </w:r>
-          </w:p>
-        </w:tc>
-        <w:tc>
-          <w:tcPr>
-            <w:tcW w:type="dxa" w:w="1417"/>
-            <w:shd w:val="clear" w:color="auto" w:fill="4F6AFF"/>
-            <w:tcBorders>
-              <w:top w:val="single" w:sz="4" w:color="3A56F0"/>
-              <w:left w:val="single" w:sz="4" w:color="3A56F0"/>
-              <w:bottom w:val="single" w:sz="4" w:color="3A56F0"/>
-              <w:right w:val="single" w:sz="4" w:color="3A56F0"/>
-              <w:insideH w:val="single" w:sz="4" w:color="3A56F0"/>
-              <w:insideV w:val="single" w:sz="4" w:color="3A56F0"/>
-            </w:tcBorders>
-          </w:tcPr>
-          <w:p>
-            <w:pPr>
-              <w:jc w:val="left"/>
-            </w:pPr>
-            <w:r>
-              <w:rPr>
-                <w:b/>
-                <w:color w:val="FFFFFF"/>
-                <w:sz w:val="18"/>
-              </w:rPr>
-              <w:t>Тип</w:t>
-            </w:r>
-          </w:p>
-        </w:tc>
-        <w:tc>
-          <w:tcPr>
-            <w:tcW w:type="dxa" w:w="1984"/>
-            <w:shd w:val="clear" w:color="auto" w:fill="4F6AFF"/>
-            <w:tcBorders>
-              <w:top w:val="single" w:sz="4" w:color="3A56F0"/>
-              <w:left w:val="single" w:sz="4" w:color="3A56F0"/>
-              <w:bottom w:val="single" w:sz="4" w:color="3A56F0"/>
-              <w:right w:val="single" w:sz="4" w:color="3A56F0"/>
-              <w:insideH w:val="single" w:sz="4" w:color="3A56F0"/>
-              <w:insideV w:val="single" w:sz="4" w:color="3A56F0"/>
-            </w:tcBorders>
-          </w:tcPr>
-          <w:p>
-            <w:pPr>
-              <w:jc w:val="left"/>
-            </w:pPr>
-            <w:r>
-              <w:rPr>
-                <w:b/>
-                <w:color w:val="FFFFFF"/>
-                <w:sz w:val="18"/>
-              </w:rPr>
-              <w:t>Умолчание</w:t>
-            </w:r>
-          </w:p>
-        </w:tc>
-        <w:tc>
-          <w:tcPr>
-            <w:tcW w:type="dxa" w:w="4535"/>
-            <w:shd w:val="clear" w:color="auto" w:fill="4F6AFF"/>
-            <w:tcBorders>
-              <w:top w:val="single" w:sz="4" w:color="3A56F0"/>
-              <w:left w:val="single" w:sz="4" w:color="3A56F0"/>
-              <w:bottom w:val="single" w:sz="4" w:color="3A56F0"/>
-              <w:right w:val="single" w:sz="4" w:color="3A56F0"/>
-              <w:insideH w:val="single" w:sz="4" w:color="3A56F0"/>
-              <w:insideV w:val="single" w:sz="4" w:color="3A56F0"/>
-            </w:tcBorders>
-          </w:tcPr>
-          <w:p>
-            <w:pPr>
-              <w:jc w:val="left"/>
-            </w:pPr>
-            <w:r>
-              <w:rPr>
-                <w:b/>
-                <w:color w:val="FFFFFF"/>
-                <w:sz w:val="18"/>
-              </w:rPr>
-              <w:t>Описание</w:t>
-            </w:r>
-          </w:p>
-        </w:tc>
-      </w:tr>
-      <w:tr>
-        <w:tc>
-          <w:tcPr>
-            <w:tcW w:type="dxa" w:w="2551"/>
-            <w:shd w:val="clear" w:color="auto" w:fill="FFFFFF"/>
-            <w:tcBorders>
-              <w:top w:val="single" w:sz="4" w:color="E2E8F0"/>
-              <w:left w:val="single" w:sz="4" w:color="E2E8F0"/>
-              <w:bottom w:val="single" w:sz="4" w:color="E2E8F0"/>
-              <w:right w:val="single" w:sz="4" w:color="E2E8F0"/>
-              <w:insideH w:val="single" w:sz="4" w:color="E2E8F0"/>
-              <w:insideV w:val="single" w:sz="4" w:color="E2E8F0"/>
-            </w:tcBorders>
-          </w:tcPr>
-          <w:p>
-            <w:r>
-              <w:rPr>
-                <w:b/>
-                <w:color w:val="2D3A8C"/>
-                <w:sz w:val="18"/>
-              </w:rPr>
-              <w:t>timeoutSeconds</w:t>
-            </w:r>
-          </w:p>
-        </w:tc>
-        <w:tc>
-          <w:tcPr>
-            <w:tcW w:type="dxa" w:w="1417"/>
-            <w:shd w:val="clear" w:color="auto" w:fill="FFFFFF"/>
-            <w:tcBorders>
-              <w:top w:val="single" w:sz="4" w:color="E2E8F0"/>
-              <w:left w:val="single" w:sz="4" w:color="E2E8F0"/>
-              <w:bottom w:val="single" w:sz="4" w:color="E2E8F0"/>
-              <w:right w:val="single" w:sz="4" w:color="E2E8F0"/>
-              <w:insideH w:val="single" w:sz="4" w:color="E2E8F0"/>
-              <w:insideV w:val="single" w:sz="4" w:color="E2E8F0"/>
-            </w:tcBorders>
-          </w:tcPr>
-          <w:p>
-            <w:r>
-              <w:rPr>
-                <w:color w:val="1E293B"/>
-                <w:sz w:val="18"/>
-              </w:rPr>
-              <w:t>Number</w:t>
-            </w:r>
-          </w:p>
-        </w:tc>
-        <w:tc>
-          <w:tcPr>
-            <w:tcW w:type="dxa" w:w="1984"/>
-            <w:shd w:val="clear" w:color="auto" w:fill="FFFFFF"/>
-            <w:tcBorders>
-              <w:top w:val="single" w:sz="4" w:color="E2E8F0"/>
-              <w:left w:val="single" w:sz="4" w:color="E2E8F0"/>
-              <w:bottom w:val="single" w:sz="4" w:color="E2E8F0"/>
-              <w:right w:val="single" w:sz="4" w:color="E2E8F0"/>
-              <w:insideH w:val="single" w:sz="4" w:color="E2E8F0"/>
-              <w:insideV w:val="single" w:sz="4" w:color="E2E8F0"/>
-            </w:tcBorders>
-          </w:tcPr>
-          <w:p>
-            <w:r>
-              <w:rPr>
-                <w:color w:val="1E293B"/>
-                <w:sz w:val="18"/>
-              </w:rPr>
-              <w:t>1800</w:t>
-            </w:r>
-          </w:p>
-        </w:tc>
-        <w:tc>
-          <w:tcPr>
-            <w:tcW w:type="dxa" w:w="4535"/>
-            <w:shd w:val="clear" w:color="auto" w:fill="FFFFFF"/>
-            <w:tcBorders>
-              <w:top w:val="single" w:sz="4" w:color="E2E8F0"/>
-              <w:left w:val="single" w:sz="4" w:color="E2E8F0"/>
-              <w:bottom w:val="single" w:sz="4" w:color="E2E8F0"/>
-              <w:right w:val="single" w:sz="4" w:color="E2E8F0"/>
-              <w:insideH w:val="single" w:sz="4" w:color="E2E8F0"/>
-              <w:insideV w:val="single" w:sz="4" w:color="E2E8F0"/>
-            </w:tcBorders>
-          </w:tcPr>
-          <w:p>
-            <w:r>
-              <w:rPr>
-                <w:color w:val="1E293B"/>
-                <w:sz w:val="18"/>
-              </w:rPr>
-              <w:t>Время бездействия до выхода (по умолчанию 30 минут)</w:t>
-            </w:r>
-          </w:p>
-        </w:tc>
-      </w:tr>
-      <w:tr>
-        <w:tc>
-          <w:tcPr>
-            <w:tcW w:type="dxa" w:w="2551"/>
-            <w:shd w:val="clear" w:color="auto" w:fill="F8FAFC"/>
-            <w:tcBorders>
-              <w:top w:val="single" w:sz="4" w:color="E2E8F0"/>
-              <w:left w:val="single" w:sz="4" w:color="E2E8F0"/>
-              <w:bottom w:val="single" w:sz="4" w:color="E2E8F0"/>
-              <w:right w:val="single" w:sz="4" w:color="E2E8F0"/>
-              <w:insideH w:val="single" w:sz="4" w:color="E2E8F0"/>
-              <w:insideV w:val="single" w:sz="4" w:color="E2E8F0"/>
-            </w:tcBorders>
-          </w:tcPr>
-          <w:p>
-            <w:r>
-              <w:rPr>
-                <w:b/>
-                <w:color w:val="2D3A8C"/>
-                <w:sz w:val="18"/>
-              </w:rPr>
-              <w:t>timeoutUnit</w:t>
-            </w:r>
-          </w:p>
-        </w:tc>
-        <w:tc>
-          <w:tcPr>
-            <w:tcW w:type="dxa" w:w="1417"/>
-            <w:shd w:val="clear" w:color="auto" w:fill="F8FAFC"/>
-            <w:tcBorders>
-              <w:top w:val="single" w:sz="4" w:color="E2E8F0"/>
-              <w:left w:val="single" w:sz="4" w:color="E2E8F0"/>
-              <w:bottom w:val="single" w:sz="4" w:color="E2E8F0"/>
-              <w:right w:val="single" w:sz="4" w:color="E2E8F0"/>
-              <w:insideH w:val="single" w:sz="4" w:color="E2E8F0"/>
-              <w:insideV w:val="single" w:sz="4" w:color="E2E8F0"/>
-            </w:tcBorders>
-          </w:tcPr>
-          <w:p>
-            <w:r>
-              <w:rPr>
-                <w:color w:val="1E293B"/>
-                <w:sz w:val="18"/>
-              </w:rPr>
-              <w:t>String</w:t>
-            </w:r>
-          </w:p>
-        </w:tc>
-        <w:tc>
-          <w:tcPr>
-            <w:tcW w:type="dxa" w:w="1984"/>
-            <w:shd w:val="clear" w:color="auto" w:fill="F8FAFC"/>
-            <w:tcBorders>
-              <w:top w:val="single" w:sz="4" w:color="E2E8F0"/>
-              <w:left w:val="single" w:sz="4" w:color="E2E8F0"/>
-              <w:bottom w:val="single" w:sz="4" w:color="E2E8F0"/>
-              <w:right w:val="single" w:sz="4" w:color="E2E8F0"/>
-              <w:insideH w:val="single" w:sz="4" w:color="E2E8F0"/>
-              <w:insideV w:val="single" w:sz="4" w:color="E2E8F0"/>
-            </w:tcBorders>
-          </w:tcPr>
-          <w:p>
-            <w:r>
-              <w:rPr>
-                <w:color w:val="1E293B"/>
-                <w:sz w:val="18"/>
-              </w:rPr>
-              <w:t>''</w:t>
-            </w:r>
-          </w:p>
-        </w:tc>
-        <w:tc>
-          <w:tcPr>
-            <w:tcW w:type="dxa" w:w="4535"/>
-            <w:shd w:val="clear" w:color="auto" w:fill="F8FAFC"/>
-            <w:tcBorders>
-              <w:top w:val="single" w:sz="4" w:color="E2E8F0"/>
-              <w:left w:val="single" w:sz="4" w:color="E2E8F0"/>
-              <w:bottom w:val="single" w:sz="4" w:color="E2E8F0"/>
-              <w:right w:val="single" w:sz="4" w:color="E2E8F0"/>
-              <w:insideH w:val="single" w:sz="4" w:color="E2E8F0"/>
-              <w:insideV w:val="single" w:sz="4" w:color="E2E8F0"/>
-            </w:tcBorders>
-          </w:tcPr>
-          <w:p>
-            <w:r>
-              <w:rPr>
-                <w:color w:val="1E293B"/>
-                <w:sz w:val="18"/>
-              </w:rPr>
-              <w:t>Единица измерения таймаута (s = секунды, m = минуты, h = часы). Если пусто — секунды</w:t>
-            </w:r>
-          </w:p>
-        </w:tc>
-      </w:tr>
-      <w:tr>
-        <w:tc>
-          <w:tcPr>
-            <w:tcW w:type="dxa" w:w="2551"/>
-            <w:shd w:val="clear" w:color="auto" w:fill="FFFFFF"/>
-            <w:tcBorders>
-              <w:top w:val="single" w:sz="4" w:color="E2E8F0"/>
-              <w:left w:val="single" w:sz="4" w:color="E2E8F0"/>
-              <w:bottom w:val="single" w:sz="4" w:color="E2E8F0"/>
-              <w:right w:val="single" w:sz="4" w:color="E2E8F0"/>
-              <w:insideH w:val="single" w:sz="4" w:color="E2E8F0"/>
-              <w:insideV w:val="single" w:sz="4" w:color="E2E8F0"/>
-            </w:tcBorders>
-          </w:tcPr>
-          <w:p>
-            <w:r>
-              <w:rPr>
-                <w:b/>
-                <w:color w:val="2D3A8C"/>
-                <w:sz w:val="18"/>
-              </w:rPr>
-              <w:t>warningEnabled</w:t>
-            </w:r>
-          </w:p>
-        </w:tc>
-        <w:tc>
-          <w:tcPr>
-            <w:tcW w:type="dxa" w:w="1417"/>
-            <w:shd w:val="clear" w:color="auto" w:fill="FFFFFF"/>
-            <w:tcBorders>
-              <w:top w:val="single" w:sz="4" w:color="E2E8F0"/>
-              <w:left w:val="single" w:sz="4" w:color="E2E8F0"/>
-              <w:bottom w:val="single" w:sz="4" w:color="E2E8F0"/>
-              <w:right w:val="single" w:sz="4" w:color="E2E8F0"/>
-              <w:insideH w:val="single" w:sz="4" w:color="E2E8F0"/>
-              <w:insideV w:val="single" w:sz="4" w:color="E2E8F0"/>
-            </w:tcBorders>
-          </w:tcPr>
-          <w:p>
-            <w:r>
-              <w:rPr>
-                <w:color w:val="1E293B"/>
-                <w:sz w:val="18"/>
-              </w:rPr>
-              <w:t>Boolean</w:t>
-            </w:r>
-          </w:p>
-        </w:tc>
-        <w:tc>
-          <w:tcPr>
-            <w:tcW w:type="dxa" w:w="1984"/>
-            <w:shd w:val="clear" w:color="auto" w:fill="FFFFFF"/>
-            <w:tcBorders>
-              <w:top w:val="single" w:sz="4" w:color="E2E8F0"/>
-              <w:left w:val="single" w:sz="4" w:color="E2E8F0"/>
-              <w:bottom w:val="single" w:sz="4" w:color="E2E8F0"/>
-              <w:right w:val="single" w:sz="4" w:color="E2E8F0"/>
-              <w:insideH w:val="single" w:sz="4" w:color="E2E8F0"/>
-              <w:insideV w:val="single" w:sz="4" w:color="E2E8F0"/>
-            </w:tcBorders>
-          </w:tcPr>
-          <w:p>
-            <w:r>
-              <w:rPr>
-                <w:color w:val="1E293B"/>
-                <w:sz w:val="18"/>
-              </w:rPr>
-              <w:t>true</w:t>
-            </w:r>
-          </w:p>
-        </w:tc>
-        <w:tc>
-          <w:tcPr>
-            <w:tcW w:type="dxa" w:w="4535"/>
-            <w:shd w:val="clear" w:color="auto" w:fill="FFFFFF"/>
-            <w:tcBorders>
-              <w:top w:val="single" w:sz="4" w:color="E2E8F0"/>
-              <w:left w:val="single" w:sz="4" w:color="E2E8F0"/>
-              <w:bottom w:val="single" w:sz="4" w:color="E2E8F0"/>
-              <w:right w:val="single" w:sz="4" w:color="E2E8F0"/>
-              <w:insideH w:val="single" w:sz="4" w:color="E2E8F0"/>
-              <w:insideV w:val="single" w:sz="4" w:color="E2E8F0"/>
-            </w:tcBorders>
-          </w:tcPr>
-          <w:p>
-            <w:r>
-              <w:rPr>
-                <w:color w:val="1E293B"/>
-                <w:sz w:val="18"/>
-              </w:rPr>
-              <w:t>Показывать предупреждение перед выходом</w:t>
-            </w:r>
-          </w:p>
-        </w:tc>
-      </w:tr>
-      <w:tr>
-        <w:tc>
-          <w:tcPr>
-            <w:tcW w:type="dxa" w:w="2551"/>
-            <w:shd w:val="clear" w:color="auto" w:fill="F8FAFC"/>
-            <w:tcBorders>
-              <w:top w:val="single" w:sz="4" w:color="E2E8F0"/>
-              <w:left w:val="single" w:sz="4" w:color="E2E8F0"/>
-              <w:bottom w:val="single" w:sz="4" w:color="E2E8F0"/>
-              <w:right w:val="single" w:sz="4" w:color="E2E8F0"/>
-              <w:insideH w:val="single" w:sz="4" w:color="E2E8F0"/>
-              <w:insideV w:val="single" w:sz="4" w:color="E2E8F0"/>
-            </w:tcBorders>
-          </w:tcPr>
-          <w:p>
-            <w:r>
-              <w:rPr>
-                <w:b/>
-                <w:color w:val="2D3A8C"/>
-                <w:sz w:val="18"/>
-              </w:rPr>
-              <w:t>warningDuration</w:t>
-            </w:r>
-          </w:p>
-        </w:tc>
-        <w:tc>
-          <w:tcPr>
-            <w:tcW w:type="dxa" w:w="1417"/>
-            <w:shd w:val="clear" w:color="auto" w:fill="F8FAFC"/>
-            <w:tcBorders>
-              <w:top w:val="single" w:sz="4" w:color="E2E8F0"/>
-              <w:left w:val="single" w:sz="4" w:color="E2E8F0"/>
-              <w:bottom w:val="single" w:sz="4" w:color="E2E8F0"/>
-              <w:right w:val="single" w:sz="4" w:color="E2E8F0"/>
-              <w:insideH w:val="single" w:sz="4" w:color="E2E8F0"/>
-              <w:insideV w:val="single" w:sz="4" w:color="E2E8F0"/>
-            </w:tcBorders>
-          </w:tcPr>
-          <w:p>
-            <w:r>
-              <w:rPr>
-                <w:color w:val="1E293B"/>
-                <w:sz w:val="18"/>
-              </w:rPr>
-              <w:t>Number</w:t>
-            </w:r>
-          </w:p>
-        </w:tc>
-        <w:tc>
-          <w:tcPr>
-            <w:tcW w:type="dxa" w:w="1984"/>
-            <w:shd w:val="clear" w:color="auto" w:fill="F8FAFC"/>
-            <w:tcBorders>
-              <w:top w:val="single" w:sz="4" w:color="E2E8F0"/>
-              <w:left w:val="single" w:sz="4" w:color="E2E8F0"/>
-              <w:bottom w:val="single" w:sz="4" w:color="E2E8F0"/>
-              <w:right w:val="single" w:sz="4" w:color="E2E8F0"/>
-              <w:insideH w:val="single" w:sz="4" w:color="E2E8F0"/>
-              <w:insideV w:val="single" w:sz="4" w:color="E2E8F0"/>
-            </w:tcBorders>
-          </w:tcPr>
-          <w:p>
-            <w:r>
-              <w:rPr>
-                <w:color w:val="1E293B"/>
-                <w:sz w:val="18"/>
-              </w:rPr>
-              <w:t>30</w:t>
-            </w:r>
-          </w:p>
-        </w:tc>
-        <w:tc>
-          <w:tcPr>
-            <w:tcW w:type="dxa" w:w="4535"/>
-            <w:shd w:val="clear" w:color="auto" w:fill="F8FAFC"/>
-            <w:tcBorders>
-              <w:top w:val="single" w:sz="4" w:color="E2E8F0"/>
-              <w:left w:val="single" w:sz="4" w:color="E2E8F0"/>
-              <w:bottom w:val="single" w:sz="4" w:color="E2E8F0"/>
-              <w:right w:val="single" w:sz="4" w:color="E2E8F0"/>
-              <w:insideH w:val="single" w:sz="4" w:color="E2E8F0"/>
-              <w:insideV w:val="single" w:sz="4" w:color="E2E8F0"/>
-            </w:tcBorders>
-          </w:tcPr>
-          <w:p>
-            <w:r>
-              <w:rPr>
-                <w:color w:val="1E293B"/>
-                <w:sz w:val="18"/>
-              </w:rPr>
-              <w:t>Время предупреждения до выхода</w:t>
-            </w:r>
-          </w:p>
-        </w:tc>
-      </w:tr>
-      <w:tr>
-        <w:tc>
-          <w:tcPr>
-            <w:tcW w:type="dxa" w:w="2551"/>
-            <w:shd w:val="clear" w:color="auto" w:fill="FFFFFF"/>
-            <w:tcBorders>
-              <w:top w:val="single" w:sz="4" w:color="E2E8F0"/>
-              <w:left w:val="single" w:sz="4" w:color="E2E8F0"/>
-              <w:bottom w:val="single" w:sz="4" w:color="E2E8F0"/>
-              <w:right w:val="single" w:sz="4" w:color="E2E8F0"/>
-              <w:insideH w:val="single" w:sz="4" w:color="E2E8F0"/>
-              <w:insideV w:val="single" w:sz="4" w:color="E2E8F0"/>
-            </w:tcBorders>
-          </w:tcPr>
-          <w:p>
-            <w:r>
-              <w:rPr>
-                <w:b/>
-                <w:color w:val="2D3A8C"/>
-                <w:sz w:val="18"/>
-              </w:rPr>
-              <w:t>warningUnit</w:t>
-            </w:r>
-          </w:p>
-        </w:tc>
-        <w:tc>
-          <w:tcPr>
-            <w:tcW w:type="dxa" w:w="1417"/>
-            <w:shd w:val="clear" w:color="auto" w:fill="FFFFFF"/>
-            <w:tcBorders>
-              <w:top w:val="single" w:sz="4" w:color="E2E8F0"/>
-              <w:left w:val="single" w:sz="4" w:color="E2E8F0"/>
-              <w:bottom w:val="single" w:sz="4" w:color="E2E8F0"/>
-              <w:right w:val="single" w:sz="4" w:color="E2E8F0"/>
-              <w:insideH w:val="single" w:sz="4" w:color="E2E8F0"/>
-              <w:insideV w:val="single" w:sz="4" w:color="E2E8F0"/>
-            </w:tcBorders>
-          </w:tcPr>
-          <w:p>
-            <w:r>
-              <w:rPr>
-                <w:color w:val="1E293B"/>
-                <w:sz w:val="18"/>
-              </w:rPr>
-              <w:t>String</w:t>
-            </w:r>
-          </w:p>
-        </w:tc>
-        <w:tc>
-          <w:tcPr>
-            <w:tcW w:type="dxa" w:w="1984"/>
-            <w:shd w:val="clear" w:color="auto" w:fill="FFFFFF"/>
-            <w:tcBorders>
-              <w:top w:val="single" w:sz="4" w:color="E2E8F0"/>
-              <w:left w:val="single" w:sz="4" w:color="E2E8F0"/>
-              <w:bottom w:val="single" w:sz="4" w:color="E2E8F0"/>
-              <w:right w:val="single" w:sz="4" w:color="E2E8F0"/>
-              <w:insideH w:val="single" w:sz="4" w:color="E2E8F0"/>
-              <w:insideV w:val="single" w:sz="4" w:color="E2E8F0"/>
-            </w:tcBorders>
-          </w:tcPr>
-          <w:p>
-            <w:r>
-              <w:rPr>
-                <w:color w:val="1E293B"/>
-                <w:sz w:val="18"/>
-              </w:rPr>
-              <w:t>''</w:t>
-            </w:r>
-          </w:p>
-        </w:tc>
-        <w:tc>
-          <w:tcPr>
-            <w:tcW w:type="dxa" w:w="4535"/>
-            <w:shd w:val="clear" w:color="auto" w:fill="FFFFFF"/>
-            <w:tcBorders>
-              <w:top w:val="single" w:sz="4" w:color="E2E8F0"/>
-              <w:left w:val="single" w:sz="4" w:color="E2E8F0"/>
-              <w:bottom w:val="single" w:sz="4" w:color="E2E8F0"/>
-              <w:right w:val="single" w:sz="4" w:color="E2E8F0"/>
-              <w:insideH w:val="single" w:sz="4" w:color="E2E8F0"/>
-              <w:insideV w:val="single" w:sz="4" w:color="E2E8F0"/>
-            </w:tcBorders>
-          </w:tcPr>
-          <w:p>
-            <w:r>
-              <w:rPr>
-                <w:color w:val="1E293B"/>
-                <w:sz w:val="18"/>
-              </w:rPr>
-              <w:t>Единица измерения предупреждения (по умолчанию секунды)</w:t>
-            </w:r>
-          </w:p>
-        </w:tc>
-      </w:tr>
-    </w:tbl>
-    <w:p/>
-    <w:p>
-      <w:r>
-        <w:rPr>
-          <w:b/>
-          <w:color w:val="1E293B"/>
-          <w:sz w:val="22"/>
-        </w:rPr>
-        <w:t>Тексты</w:t>
-      </w:r>
-    </w:p>
-    <w:tbl>
-      <w:tblPr>
-        <w:tblW w:type="auto" w:w="0"/>
-        <w:jc w:val="left"/>
-        <w:tblLook w:firstColumn="1" w:firstRow="1" w:lastColumn="0" w:lastRow="0" w:noHBand="0" w:noVBand="1" w:val="04A0"/>
-      </w:tblPr>
-      <w:tblGrid>
-        <w:gridCol w:w="2351"/>
-        <w:gridCol w:w="2351"/>
-        <w:gridCol w:w="2351"/>
-        <w:gridCol w:w="2351"/>
-      </w:tblGrid>
-      <w:tr>
-        <w:tc>
-          <w:tcPr>
-            <w:tcW w:type="dxa" w:w="2551"/>
-            <w:shd w:val="clear" w:color="auto" w:fill="4F6AFF"/>
-            <w:tcBorders>
-              <w:top w:val="single" w:sz="4" w:color="3A56F0"/>
-              <w:left w:val="single" w:sz="4" w:color="3A56F0"/>
-              <w:bottom w:val="single" w:sz="4" w:color="3A56F0"/>
-              <w:right w:val="single" w:sz="4" w:color="3A56F0"/>
-              <w:insideH w:val="single" w:sz="4" w:color="3A56F0"/>
-              <w:insideV w:val="single" w:sz="4" w:color="3A56F0"/>
-            </w:tcBorders>
-          </w:tcPr>
-          <w:p>
-            <w:pPr>
-              <w:jc w:val="left"/>
-            </w:pPr>
-            <w:r>
-              <w:rPr>
-                <w:b/>
-                <w:color w:val="FFFFFF"/>
-                <w:sz w:val="18"/>
-              </w:rPr>
-              <w:t>Параметр</w:t>
-            </w:r>
-          </w:p>
-        </w:tc>
-        <w:tc>
-          <w:tcPr>
-            <w:tcW w:type="dxa" w:w="1417"/>
-            <w:shd w:val="clear" w:color="auto" w:fill="4F6AFF"/>
-            <w:tcBorders>
-              <w:top w:val="single" w:sz="4" w:color="3A56F0"/>
-              <w:left w:val="single" w:sz="4" w:color="3A56F0"/>
-              <w:bottom w:val="single" w:sz="4" w:color="3A56F0"/>
-              <w:right w:val="single" w:sz="4" w:color="3A56F0"/>
-              <w:insideH w:val="single" w:sz="4" w:color="3A56F0"/>
-              <w:insideV w:val="single" w:sz="4" w:color="3A56F0"/>
-            </w:tcBorders>
-          </w:tcPr>
-          <w:p>
-            <w:pPr>
-              <w:jc w:val="left"/>
-            </w:pPr>
-            <w:r>
-              <w:rPr>
-                <w:b/>
-                <w:color w:val="FFFFFF"/>
-                <w:sz w:val="18"/>
-              </w:rPr>
-              <w:t>Тип</w:t>
-            </w:r>
-          </w:p>
-        </w:tc>
-        <w:tc>
-          <w:tcPr>
-            <w:tcW w:type="dxa" w:w="1984"/>
-            <w:shd w:val="clear" w:color="auto" w:fill="4F6AFF"/>
-            <w:tcBorders>
-              <w:top w:val="single" w:sz="4" w:color="3A56F0"/>
-              <w:left w:val="single" w:sz="4" w:color="3A56F0"/>
-              <w:bottom w:val="single" w:sz="4" w:color="3A56F0"/>
-              <w:right w:val="single" w:sz="4" w:color="3A56F0"/>
-              <w:insideH w:val="single" w:sz="4" w:color="3A56F0"/>
-              <w:insideV w:val="single" w:sz="4" w:color="3A56F0"/>
-            </w:tcBorders>
-          </w:tcPr>
-          <w:p>
-            <w:pPr>
-              <w:jc w:val="left"/>
-            </w:pPr>
-            <w:r>
-              <w:rPr>
-                <w:b/>
-                <w:color w:val="FFFFFF"/>
-                <w:sz w:val="18"/>
-              </w:rPr>
-              <w:t>Умолчание</w:t>
-            </w:r>
-          </w:p>
-        </w:tc>
-        <w:tc>
-          <w:tcPr>
-            <w:tcW w:type="dxa" w:w="4535"/>
-            <w:shd w:val="clear" w:color="auto" w:fill="4F6AFF"/>
-            <w:tcBorders>
-              <w:top w:val="single" w:sz="4" w:color="3A56F0"/>
-              <w:left w:val="single" w:sz="4" w:color="3A56F0"/>
-              <w:bottom w:val="single" w:sz="4" w:color="3A56F0"/>
-              <w:right w:val="single" w:sz="4" w:color="3A56F0"/>
-              <w:insideH w:val="single" w:sz="4" w:color="3A56F0"/>
-              <w:insideV w:val="single" w:sz="4" w:color="3A56F0"/>
-            </w:tcBorders>
-          </w:tcPr>
-          <w:p>
-            <w:pPr>
-              <w:jc w:val="left"/>
-            </w:pPr>
-            <w:r>
-              <w:rPr>
-                <w:b/>
-                <w:color w:val="FFFFFF"/>
-                <w:sz w:val="18"/>
-              </w:rPr>
-              <w:t>Описание</w:t>
-            </w:r>
-          </w:p>
-        </w:tc>
-      </w:tr>
-      <w:tr>
-        <w:tc>
-          <w:tcPr>
-            <w:tcW w:type="dxa" w:w="2551"/>
-            <w:shd w:val="clear" w:color="auto" w:fill="FFFFFF"/>
-            <w:tcBorders>
-              <w:top w:val="single" w:sz="4" w:color="E2E8F0"/>
-              <w:left w:val="single" w:sz="4" w:color="E2E8F0"/>
-              <w:bottom w:val="single" w:sz="4" w:color="E2E8F0"/>
-              <w:right w:val="single" w:sz="4" w:color="E2E8F0"/>
-              <w:insideH w:val="single" w:sz="4" w:color="E2E8F0"/>
-              <w:insideV w:val="single" w:sz="4" w:color="E2E8F0"/>
-            </w:tcBorders>
-          </w:tcPr>
-          <w:p>
-            <w:r>
-              <w:rPr>
-                <w:b/>
-                <w:color w:val="2D3A8C"/>
-                <w:sz w:val="18"/>
-              </w:rPr>
-              <w:t>labels.warningTitle</w:t>
-            </w:r>
-          </w:p>
-        </w:tc>
-        <w:tc>
-          <w:tcPr>
-            <w:tcW w:type="dxa" w:w="1417"/>
-            <w:shd w:val="clear" w:color="auto" w:fill="FFFFFF"/>
-            <w:tcBorders>
-              <w:top w:val="single" w:sz="4" w:color="E2E8F0"/>
-              <w:left w:val="single" w:sz="4" w:color="E2E8F0"/>
-              <w:bottom w:val="single" w:sz="4" w:color="E2E8F0"/>
-              <w:right w:val="single" w:sz="4" w:color="E2E8F0"/>
-              <w:insideH w:val="single" w:sz="4" w:color="E2E8F0"/>
-              <w:insideV w:val="single" w:sz="4" w:color="E2E8F0"/>
-            </w:tcBorders>
-          </w:tcPr>
-          <w:p>
-            <w:r>
-              <w:rPr>
-                <w:color w:val="1E293B"/>
-                <w:sz w:val="18"/>
-              </w:rPr>
-              <w:t>String</w:t>
-            </w:r>
-          </w:p>
-        </w:tc>
-        <w:tc>
-          <w:tcPr>
-            <w:tcW w:type="dxa" w:w="1984"/>
-            <w:shd w:val="clear" w:color="auto" w:fill="FFFFFF"/>
-            <w:tcBorders>
-              <w:top w:val="single" w:sz="4" w:color="E2E8F0"/>
-              <w:left w:val="single" w:sz="4" w:color="E2E8F0"/>
-              <w:bottom w:val="single" w:sz="4" w:color="E2E8F0"/>
-              <w:right w:val="single" w:sz="4" w:color="E2E8F0"/>
-              <w:insideH w:val="single" w:sz="4" w:color="E2E8F0"/>
-              <w:insideV w:val="single" w:sz="4" w:color="E2E8F0"/>
-            </w:tcBorders>
-          </w:tcPr>
-          <w:p>
-            <w:r>
-              <w:rPr>
-                <w:color w:val="1E293B"/>
-                <w:sz w:val="18"/>
-              </w:rPr>
-              <w:t>Сессия истекает</w:t>
-            </w:r>
-          </w:p>
-        </w:tc>
-        <w:tc>
-          <w:tcPr>
-            <w:tcW w:type="dxa" w:w="4535"/>
-            <w:shd w:val="clear" w:color="auto" w:fill="FFFFFF"/>
-            <w:tcBorders>
-              <w:top w:val="single" w:sz="4" w:color="E2E8F0"/>
-              <w:left w:val="single" w:sz="4" w:color="E2E8F0"/>
-              <w:bottom w:val="single" w:sz="4" w:color="E2E8F0"/>
-              <w:right w:val="single" w:sz="4" w:color="E2E8F0"/>
-              <w:insideH w:val="single" w:sz="4" w:color="E2E8F0"/>
-              <w:insideV w:val="single" w:sz="4" w:color="E2E8F0"/>
-            </w:tcBorders>
-          </w:tcPr>
-          <w:p>
-            <w:r>
-              <w:rPr>
-                <w:color w:val="1E293B"/>
-                <w:sz w:val="18"/>
-              </w:rPr>
-              <w:t>Заголовок диалога</w:t>
-            </w:r>
-          </w:p>
-        </w:tc>
-      </w:tr>
-      <w:tr>
-        <w:tc>
-          <w:tcPr>
-            <w:tcW w:type="dxa" w:w="2551"/>
-            <w:shd w:val="clear" w:color="auto" w:fill="F8FAFC"/>
-            <w:tcBorders>
-              <w:top w:val="single" w:sz="4" w:color="E2E8F0"/>
-              <w:left w:val="single" w:sz="4" w:color="E2E8F0"/>
-              <w:bottom w:val="single" w:sz="4" w:color="E2E8F0"/>
-              <w:right w:val="single" w:sz="4" w:color="E2E8F0"/>
-              <w:insideH w:val="single" w:sz="4" w:color="E2E8F0"/>
-              <w:insideV w:val="single" w:sz="4" w:color="E2E8F0"/>
-            </w:tcBorders>
-          </w:tcPr>
-          <w:p>
-            <w:r>
-              <w:rPr>
-                <w:b/>
-                <w:color w:val="2D3A8C"/>
-                <w:sz w:val="18"/>
-              </w:rPr>
-              <w:t>labels.warningMessage</w:t>
-            </w:r>
-          </w:p>
-        </w:tc>
-        <w:tc>
-          <w:tcPr>
-            <w:tcW w:type="dxa" w:w="1417"/>
-            <w:shd w:val="clear" w:color="auto" w:fill="F8FAFC"/>
-            <w:tcBorders>
-              <w:top w:val="single" w:sz="4" w:color="E2E8F0"/>
-              <w:left w:val="single" w:sz="4" w:color="E2E8F0"/>
-              <w:bottom w:val="single" w:sz="4" w:color="E2E8F0"/>
-              <w:right w:val="single" w:sz="4" w:color="E2E8F0"/>
-              <w:insideH w:val="single" w:sz="4" w:color="E2E8F0"/>
-              <w:insideV w:val="single" w:sz="4" w:color="E2E8F0"/>
-            </w:tcBorders>
-          </w:tcPr>
-          <w:p>
-            <w:r>
-              <w:rPr>
-                <w:color w:val="1E293B"/>
-                <w:sz w:val="18"/>
-              </w:rPr>
-              <w:t>String</w:t>
-            </w:r>
-          </w:p>
-        </w:tc>
-        <w:tc>
-          <w:tcPr>
-            <w:tcW w:type="dxa" w:w="1984"/>
-            <w:shd w:val="clear" w:color="auto" w:fill="F8FAFC"/>
-            <w:tcBorders>
-              <w:top w:val="single" w:sz="4" w:color="E2E8F0"/>
-              <w:left w:val="single" w:sz="4" w:color="E2E8F0"/>
-              <w:bottom w:val="single" w:sz="4" w:color="E2E8F0"/>
-              <w:right w:val="single" w:sz="4" w:color="E2E8F0"/>
-              <w:insideH w:val="single" w:sz="4" w:color="E2E8F0"/>
-              <w:insideV w:val="single" w:sz="4" w:color="E2E8F0"/>
-            </w:tcBorders>
-          </w:tcPr>
-          <w:p>
-            <w:r>
-              <w:rPr>
-                <w:color w:val="1E293B"/>
-                <w:sz w:val="18"/>
-              </w:rPr>
-              <w:t>Вы будете выведены через</w:t>
-            </w:r>
-          </w:p>
-        </w:tc>
-        <w:tc>
-          <w:tcPr>
-            <w:tcW w:type="dxa" w:w="4535"/>
-            <w:shd w:val="clear" w:color="auto" w:fill="F8FAFC"/>
-            <w:tcBorders>
-              <w:top w:val="single" w:sz="4" w:color="E2E8F0"/>
-              <w:left w:val="single" w:sz="4" w:color="E2E8F0"/>
-              <w:bottom w:val="single" w:sz="4" w:color="E2E8F0"/>
-              <w:right w:val="single" w:sz="4" w:color="E2E8F0"/>
-              <w:insideH w:val="single" w:sz="4" w:color="E2E8F0"/>
-              <w:insideV w:val="single" w:sz="4" w:color="E2E8F0"/>
-            </w:tcBorders>
-          </w:tcPr>
-          <w:p>
-            <w:r>
-              <w:rPr>
-                <w:color w:val="1E293B"/>
-                <w:sz w:val="18"/>
-              </w:rPr>
-              <w:t>Сообщение перед обратным отсчётом</w:t>
-            </w:r>
-          </w:p>
-        </w:tc>
-      </w:tr>
-      <w:tr>
-        <w:tc>
-          <w:tcPr>
-            <w:tcW w:type="dxa" w:w="2551"/>
-            <w:shd w:val="clear" w:color="auto" w:fill="FFFFFF"/>
-            <w:tcBorders>
-              <w:top w:val="single" w:sz="4" w:color="E2E8F0"/>
-              <w:left w:val="single" w:sz="4" w:color="E2E8F0"/>
-              <w:bottom w:val="single" w:sz="4" w:color="E2E8F0"/>
-              <w:right w:val="single" w:sz="4" w:color="E2E8F0"/>
-              <w:insideH w:val="single" w:sz="4" w:color="E2E8F0"/>
-              <w:insideV w:val="single" w:sz="4" w:color="E2E8F0"/>
-            </w:tcBorders>
-          </w:tcPr>
-          <w:p>
-            <w:r>
-              <w:rPr>
-                <w:b/>
-                <w:color w:val="2D3A8C"/>
-                <w:sz w:val="18"/>
-              </w:rPr>
-              <w:t>labels.stayLoggedIn</w:t>
-            </w:r>
-          </w:p>
-        </w:tc>
-        <w:tc>
-          <w:tcPr>
-            <w:tcW w:type="dxa" w:w="1417"/>
-            <w:shd w:val="clear" w:color="auto" w:fill="FFFFFF"/>
-            <w:tcBorders>
-              <w:top w:val="single" w:sz="4" w:color="E2E8F0"/>
-              <w:left w:val="single" w:sz="4" w:color="E2E8F0"/>
-              <w:bottom w:val="single" w:sz="4" w:color="E2E8F0"/>
-              <w:right w:val="single" w:sz="4" w:color="E2E8F0"/>
-              <w:insideH w:val="single" w:sz="4" w:color="E2E8F0"/>
-              <w:insideV w:val="single" w:sz="4" w:color="E2E8F0"/>
-            </w:tcBorders>
-          </w:tcPr>
-          <w:p>
-            <w:r>
-              <w:rPr>
-                <w:color w:val="1E293B"/>
-                <w:sz w:val="18"/>
-              </w:rPr>
-              <w:t>String</w:t>
-            </w:r>
-          </w:p>
-        </w:tc>
-        <w:tc>
-          <w:tcPr>
-            <w:tcW w:type="dxa" w:w="1984"/>
-            <w:shd w:val="clear" w:color="auto" w:fill="FFFFFF"/>
-            <w:tcBorders>
-              <w:top w:val="single" w:sz="4" w:color="E2E8F0"/>
-              <w:left w:val="single" w:sz="4" w:color="E2E8F0"/>
-              <w:bottom w:val="single" w:sz="4" w:color="E2E8F0"/>
-              <w:right w:val="single" w:sz="4" w:color="E2E8F0"/>
-              <w:insideH w:val="single" w:sz="4" w:color="E2E8F0"/>
-              <w:insideV w:val="single" w:sz="4" w:color="E2E8F0"/>
-            </w:tcBorders>
-          </w:tcPr>
-          <w:p>
-            <w:r>
-              <w:rPr>
-                <w:color w:val="1E293B"/>
-                <w:sz w:val="18"/>
-              </w:rPr>
-              <w:t>Оставаться в системе</w:t>
-            </w:r>
-          </w:p>
-        </w:tc>
-        <w:tc>
-          <w:tcPr>
-            <w:tcW w:type="dxa" w:w="4535"/>
-            <w:shd w:val="clear" w:color="auto" w:fill="FFFFFF"/>
-            <w:tcBorders>
-              <w:top w:val="single" w:sz="4" w:color="E2E8F0"/>
-              <w:left w:val="single" w:sz="4" w:color="E2E8F0"/>
-              <w:bottom w:val="single" w:sz="4" w:color="E2E8F0"/>
-              <w:right w:val="single" w:sz="4" w:color="E2E8F0"/>
-              <w:insideH w:val="single" w:sz="4" w:color="E2E8F0"/>
-              <w:insideV w:val="single" w:sz="4" w:color="E2E8F0"/>
-            </w:tcBorders>
-          </w:tcPr>
-          <w:p>
-            <w:r>
-              <w:rPr>
-                <w:color w:val="1E293B"/>
-                <w:sz w:val="18"/>
-              </w:rPr>
-              <w:t>Текст кнопки продления сессии</w:t>
-            </w:r>
-          </w:p>
-        </w:tc>
-      </w:tr>
-      <w:tr>
-        <w:tc>
-          <w:tcPr>
-            <w:tcW w:type="dxa" w:w="2551"/>
-            <w:shd w:val="clear" w:color="auto" w:fill="F8FAFC"/>
-            <w:tcBorders>
-              <w:top w:val="single" w:sz="4" w:color="E2E8F0"/>
-              <w:left w:val="single" w:sz="4" w:color="E2E8F0"/>
-              <w:bottom w:val="single" w:sz="4" w:color="E2E8F0"/>
-              <w:right w:val="single" w:sz="4" w:color="E2E8F0"/>
-              <w:insideH w:val="single" w:sz="4" w:color="E2E8F0"/>
-              <w:insideV w:val="single" w:sz="4" w:color="E2E8F0"/>
-            </w:tcBorders>
-          </w:tcPr>
-          <w:p>
-            <w:r>
-              <w:rPr>
-                <w:b/>
-                <w:color w:val="2D3A8C"/>
-                <w:sz w:val="18"/>
-              </w:rPr>
-              <w:t>labels.seconds</w:t>
-            </w:r>
-          </w:p>
-        </w:tc>
-        <w:tc>
-          <w:tcPr>
-            <w:tcW w:type="dxa" w:w="1417"/>
-            <w:shd w:val="clear" w:color="auto" w:fill="F8FAFC"/>
-            <w:tcBorders>
-              <w:top w:val="single" w:sz="4" w:color="E2E8F0"/>
-              <w:left w:val="single" w:sz="4" w:color="E2E8F0"/>
-              <w:bottom w:val="single" w:sz="4" w:color="E2E8F0"/>
-              <w:right w:val="single" w:sz="4" w:color="E2E8F0"/>
-              <w:insideH w:val="single" w:sz="4" w:color="E2E8F0"/>
-              <w:insideV w:val="single" w:sz="4" w:color="E2E8F0"/>
-            </w:tcBorders>
-          </w:tcPr>
-          <w:p>
-            <w:r>
-              <w:rPr>
-                <w:color w:val="1E293B"/>
-                <w:sz w:val="18"/>
-              </w:rPr>
-              <w:t>String</w:t>
-            </w:r>
-          </w:p>
-        </w:tc>
-        <w:tc>
-          <w:tcPr>
-            <w:tcW w:type="dxa" w:w="1984"/>
-            <w:shd w:val="clear" w:color="auto" w:fill="F8FAFC"/>
-            <w:tcBorders>
-              <w:top w:val="single" w:sz="4" w:color="E2E8F0"/>
-              <w:left w:val="single" w:sz="4" w:color="E2E8F0"/>
-              <w:bottom w:val="single" w:sz="4" w:color="E2E8F0"/>
-              <w:right w:val="single" w:sz="4" w:color="E2E8F0"/>
-              <w:insideH w:val="single" w:sz="4" w:color="E2E8F0"/>
-              <w:insideV w:val="single" w:sz="4" w:color="E2E8F0"/>
-            </w:tcBorders>
-          </w:tcPr>
-          <w:p>
-            <w:r>
-              <w:rPr>
-                <w:color w:val="1E293B"/>
-                <w:sz w:val="18"/>
-              </w:rPr>
-              <w:t>сек.</w:t>
-            </w:r>
-          </w:p>
-        </w:tc>
-        <w:tc>
-          <w:tcPr>
-            <w:tcW w:type="dxa" w:w="4535"/>
-            <w:shd w:val="clear" w:color="auto" w:fill="F8FAFC"/>
-            <w:tcBorders>
-              <w:top w:val="single" w:sz="4" w:color="E2E8F0"/>
-              <w:left w:val="single" w:sz="4" w:color="E2E8F0"/>
-              <w:bottom w:val="single" w:sz="4" w:color="E2E8F0"/>
-              <w:right w:val="single" w:sz="4" w:color="E2E8F0"/>
-              <w:insideH w:val="single" w:sz="4" w:color="E2E8F0"/>
-              <w:insideV w:val="single" w:sz="4" w:color="E2E8F0"/>
-            </w:tcBorders>
-          </w:tcPr>
-          <w:p>
-            <w:r>
-              <w:rPr>
-                <w:color w:val="1E293B"/>
-                <w:sz w:val="18"/>
-              </w:rPr>
-              <w:t>Суффикс единицы времени в отсчёте</w:t>
-            </w:r>
-          </w:p>
-        </w:tc>
-      </w:tr>
-    </w:tbl>
-    <w:p/>
-    <w:p>
-      <w:r>
-        <w:rPr>
-          <w:b/>
-          <w:color w:val="1E293B"/>
-          <w:sz w:val="22"/>
-        </w:rPr>
-        <w:t>Поведение</w:t>
-      </w:r>
-    </w:p>
-    <w:tbl>
-      <w:tblPr>
-        <w:tblW w:type="auto" w:w="0"/>
-        <w:jc w:val="left"/>
-        <w:tblLook w:firstColumn="1" w:firstRow="1" w:lastColumn="0" w:lastRow="0" w:noHBand="0" w:noVBand="1" w:val="04A0"/>
-      </w:tblPr>
-      <w:tblGrid>
-        <w:gridCol w:w="2351"/>
-        <w:gridCol w:w="2351"/>
-        <w:gridCol w:w="2351"/>
-        <w:gridCol w:w="2351"/>
-      </w:tblGrid>
-      <w:tr>
-        <w:tc>
-          <w:tcPr>
-            <w:tcW w:type="dxa" w:w="2551"/>
-            <w:shd w:val="clear" w:color="auto" w:fill="4F6AFF"/>
-            <w:tcBorders>
-              <w:top w:val="single" w:sz="4" w:color="3A56F0"/>
-              <w:left w:val="single" w:sz="4" w:color="3A56F0"/>
-              <w:bottom w:val="single" w:sz="4" w:color="3A56F0"/>
-              <w:right w:val="single" w:sz="4" w:color="3A56F0"/>
-              <w:insideH w:val="single" w:sz="4" w:color="3A56F0"/>
-              <w:insideV w:val="single" w:sz="4" w:color="3A56F0"/>
-            </w:tcBorders>
-          </w:tcPr>
-          <w:p>
-            <w:pPr>
-              <w:jc w:val="left"/>
-            </w:pPr>
-            <w:r>
-              <w:rPr>
-                <w:b/>
-                <w:color w:val="FFFFFF"/>
-                <w:sz w:val="18"/>
-              </w:rPr>
-              <w:t>Параметр</w:t>
-            </w:r>
-          </w:p>
-        </w:tc>
-        <w:tc>
-          <w:tcPr>
-            <w:tcW w:type="dxa" w:w="1417"/>
-            <w:shd w:val="clear" w:color="auto" w:fill="4F6AFF"/>
-            <w:tcBorders>
-              <w:top w:val="single" w:sz="4" w:color="3A56F0"/>
-              <w:left w:val="single" w:sz="4" w:color="3A56F0"/>
-              <w:bottom w:val="single" w:sz="4" w:color="3A56F0"/>
-              <w:right w:val="single" w:sz="4" w:color="3A56F0"/>
-              <w:insideH w:val="single" w:sz="4" w:color="3A56F0"/>
-              <w:insideV w:val="single" w:sz="4" w:color="3A56F0"/>
-            </w:tcBorders>
-          </w:tcPr>
-          <w:p>
-            <w:pPr>
-              <w:jc w:val="left"/>
-            </w:pPr>
-            <w:r>
-              <w:rPr>
-                <w:b/>
-                <w:color w:val="FFFFFF"/>
-                <w:sz w:val="18"/>
-              </w:rPr>
-              <w:t>Тип</w:t>
-            </w:r>
-          </w:p>
-        </w:tc>
-        <w:tc>
-          <w:tcPr>
-            <w:tcW w:type="dxa" w:w="1984"/>
-            <w:shd w:val="clear" w:color="auto" w:fill="4F6AFF"/>
-            <w:tcBorders>
-              <w:top w:val="single" w:sz="4" w:color="3A56F0"/>
-              <w:left w:val="single" w:sz="4" w:color="3A56F0"/>
-              <w:bottom w:val="single" w:sz="4" w:color="3A56F0"/>
-              <w:right w:val="single" w:sz="4" w:color="3A56F0"/>
-              <w:insideH w:val="single" w:sz="4" w:color="3A56F0"/>
-              <w:insideV w:val="single" w:sz="4" w:color="3A56F0"/>
-            </w:tcBorders>
-          </w:tcPr>
-          <w:p>
-            <w:pPr>
-              <w:jc w:val="left"/>
-            </w:pPr>
-            <w:r>
-              <w:rPr>
-                <w:b/>
-                <w:color w:val="FFFFFF"/>
-                <w:sz w:val="18"/>
-              </w:rPr>
-              <w:t>Умолчание</w:t>
-            </w:r>
-          </w:p>
-        </w:tc>
-        <w:tc>
-          <w:tcPr>
-            <w:tcW w:type="dxa" w:w="4535"/>
-            <w:shd w:val="clear" w:color="auto" w:fill="4F6AFF"/>
-            <w:tcBorders>
-              <w:top w:val="single" w:sz="4" w:color="3A56F0"/>
-              <w:left w:val="single" w:sz="4" w:color="3A56F0"/>
-              <w:bottom w:val="single" w:sz="4" w:color="3A56F0"/>
-              <w:right w:val="single" w:sz="4" w:color="3A56F0"/>
-              <w:insideH w:val="single" w:sz="4" w:color="3A56F0"/>
-              <w:insideV w:val="single" w:sz="4" w:color="3A56F0"/>
-            </w:tcBorders>
-          </w:tcPr>
-          <w:p>
-            <w:pPr>
-              <w:jc w:val="left"/>
-            </w:pPr>
-            <w:r>
-              <w:rPr>
-                <w:b/>
-                <w:color w:val="FFFFFF"/>
-                <w:sz w:val="18"/>
-              </w:rPr>
-              <w:t>Описание</w:t>
-            </w:r>
-          </w:p>
-        </w:tc>
-      </w:tr>
-      <w:tr>
-        <w:tc>
-          <w:tcPr>
-            <w:tcW w:type="dxa" w:w="2551"/>
-            <w:shd w:val="clear" w:color="auto" w:fill="FFFFFF"/>
-            <w:tcBorders>
-              <w:top w:val="single" w:sz="4" w:color="E2E8F0"/>
-              <w:left w:val="single" w:sz="4" w:color="E2E8F0"/>
-              <w:bottom w:val="single" w:sz="4" w:color="E2E8F0"/>
-              <w:right w:val="single" w:sz="4" w:color="E2E8F0"/>
-              <w:insideH w:val="single" w:sz="4" w:color="E2E8F0"/>
-              <w:insideV w:val="single" w:sz="4" w:color="E2E8F0"/>
-            </w:tcBorders>
-          </w:tcPr>
-          <w:p>
-            <w:r>
-              <w:rPr>
-                <w:b/>
-                <w:color w:val="2D3A8C"/>
-                <w:sz w:val="18"/>
-              </w:rPr>
-              <w:t>preserveReturnUrl</w:t>
-            </w:r>
-          </w:p>
-        </w:tc>
-        <w:tc>
-          <w:tcPr>
-            <w:tcW w:type="dxa" w:w="1417"/>
-            <w:shd w:val="clear" w:color="auto" w:fill="FFFFFF"/>
-            <w:tcBorders>
-              <w:top w:val="single" w:sz="4" w:color="E2E8F0"/>
-              <w:left w:val="single" w:sz="4" w:color="E2E8F0"/>
-              <w:bottom w:val="single" w:sz="4" w:color="E2E8F0"/>
-              <w:right w:val="single" w:sz="4" w:color="E2E8F0"/>
-              <w:insideH w:val="single" w:sz="4" w:color="E2E8F0"/>
-              <w:insideV w:val="single" w:sz="4" w:color="E2E8F0"/>
-            </w:tcBorders>
-          </w:tcPr>
-          <w:p>
-            <w:r>
-              <w:rPr>
-                <w:color w:val="1E293B"/>
-                <w:sz w:val="18"/>
-              </w:rPr>
-              <w:t>Boolean</w:t>
-            </w:r>
-          </w:p>
-        </w:tc>
-        <w:tc>
-          <w:tcPr>
-            <w:tcW w:type="dxa" w:w="1984"/>
-            <w:shd w:val="clear" w:color="auto" w:fill="FFFFFF"/>
-            <w:tcBorders>
-              <w:top w:val="single" w:sz="4" w:color="E2E8F0"/>
-              <w:left w:val="single" w:sz="4" w:color="E2E8F0"/>
-              <w:bottom w:val="single" w:sz="4" w:color="E2E8F0"/>
-              <w:right w:val="single" w:sz="4" w:color="E2E8F0"/>
-              <w:insideH w:val="single" w:sz="4" w:color="E2E8F0"/>
-              <w:insideV w:val="single" w:sz="4" w:color="E2E8F0"/>
-            </w:tcBorders>
-          </w:tcPr>
-          <w:p>
-            <w:r>
-              <w:rPr>
-                <w:color w:val="1E293B"/>
-                <w:sz w:val="18"/>
-              </w:rPr>
-              <w:t>true</w:t>
-            </w:r>
-          </w:p>
-        </w:tc>
-        <w:tc>
-          <w:tcPr>
-            <w:tcW w:type="dxa" w:w="4535"/>
-            <w:shd w:val="clear" w:color="auto" w:fill="FFFFFF"/>
-            <w:tcBorders>
-              <w:top w:val="single" w:sz="4" w:color="E2E8F0"/>
-              <w:left w:val="single" w:sz="4" w:color="E2E8F0"/>
-              <w:bottom w:val="single" w:sz="4" w:color="E2E8F0"/>
-              <w:right w:val="single" w:sz="4" w:color="E2E8F0"/>
-              <w:insideH w:val="single" w:sz="4" w:color="E2E8F0"/>
-              <w:insideV w:val="single" w:sz="4" w:color="E2E8F0"/>
-            </w:tcBorders>
-          </w:tcPr>
-          <w:p>
-            <w:r>
-              <w:rPr>
-                <w:color w:val="1E293B"/>
-                <w:sz w:val="18"/>
-              </w:rPr>
-              <w:t>Сохранять URL текущей страницы в sessionStorage для возврата после входа</w:t>
-            </w:r>
-          </w:p>
-        </w:tc>
-      </w:tr>
-    </w:tbl>
-    <w:p/>
-    <w:p>
-      <w:r>
-        <w:rPr>
-          <w:b/>
-          <w:color w:val="1E293B"/>
-          <w:sz w:val="22"/>
-        </w:rPr>
-        <w:t>Оформление диалога</w:t>
-      </w:r>
-    </w:p>
-    <w:tbl>
-      <w:tblPr>
-        <w:tblW w:type="auto" w:w="0"/>
-        <w:jc w:val="left"/>
-        <w:tblLook w:firstColumn="1" w:firstRow="1" w:lastColumn="0" w:lastRow="0" w:noHBand="0" w:noVBand="1" w:val="04A0"/>
-      </w:tblPr>
-      <w:tblGrid>
-        <w:gridCol w:w="2351"/>
-        <w:gridCol w:w="2351"/>
-        <w:gridCol w:w="2351"/>
-        <w:gridCol w:w="2351"/>
-      </w:tblGrid>
-      <w:tr>
-        <w:tc>
-          <w:tcPr>
-            <w:tcW w:type="dxa" w:w="2551"/>
-            <w:shd w:val="clear" w:color="auto" w:fill="4F6AFF"/>
-            <w:tcBorders>
-              <w:top w:val="single" w:sz="4" w:color="3A56F0"/>
-              <w:left w:val="single" w:sz="4" w:color="3A56F0"/>
-              <w:bottom w:val="single" w:sz="4" w:color="3A56F0"/>
-              <w:right w:val="single" w:sz="4" w:color="3A56F0"/>
-              <w:insideH w:val="single" w:sz="4" w:color="3A56F0"/>
-              <w:insideV w:val="single" w:sz="4" w:color="3A56F0"/>
-            </w:tcBorders>
-          </w:tcPr>
-          <w:p>
-            <w:pPr>
-              <w:jc w:val="left"/>
-            </w:pPr>
-            <w:r>
-              <w:rPr>
-                <w:b/>
-                <w:color w:val="FFFFFF"/>
-                <w:sz w:val="18"/>
-              </w:rPr>
-              <w:t>Параметр</w:t>
-            </w:r>
-          </w:p>
-        </w:tc>
-        <w:tc>
-          <w:tcPr>
-            <w:tcW w:type="dxa" w:w="1417"/>
-            <w:shd w:val="clear" w:color="auto" w:fill="4F6AFF"/>
-            <w:tcBorders>
-              <w:top w:val="single" w:sz="4" w:color="3A56F0"/>
-              <w:left w:val="single" w:sz="4" w:color="3A56F0"/>
-              <w:bottom w:val="single" w:sz="4" w:color="3A56F0"/>
-              <w:right w:val="single" w:sz="4" w:color="3A56F0"/>
-              <w:insideH w:val="single" w:sz="4" w:color="3A56F0"/>
-              <w:insideV w:val="single" w:sz="4" w:color="3A56F0"/>
-            </w:tcBorders>
-          </w:tcPr>
-          <w:p>
-            <w:pPr>
-              <w:jc w:val="left"/>
-            </w:pPr>
-            <w:r>
-              <w:rPr>
-                <w:b/>
-                <w:color w:val="FFFFFF"/>
-                <w:sz w:val="18"/>
-              </w:rPr>
-              <w:t>Тип</w:t>
-            </w:r>
-          </w:p>
-        </w:tc>
-        <w:tc>
-          <w:tcPr>
-            <w:tcW w:type="dxa" w:w="1984"/>
-            <w:shd w:val="clear" w:color="auto" w:fill="4F6AFF"/>
-            <w:tcBorders>
-              <w:top w:val="single" w:sz="4" w:color="3A56F0"/>
-              <w:left w:val="single" w:sz="4" w:color="3A56F0"/>
-              <w:bottom w:val="single" w:sz="4" w:color="3A56F0"/>
-              <w:right w:val="single" w:sz="4" w:color="3A56F0"/>
-              <w:insideH w:val="single" w:sz="4" w:color="3A56F0"/>
-              <w:insideV w:val="single" w:sz="4" w:color="3A56F0"/>
-            </w:tcBorders>
-          </w:tcPr>
-          <w:p>
-            <w:pPr>
-              <w:jc w:val="left"/>
-            </w:pPr>
-            <w:r>
-              <w:rPr>
-                <w:b/>
-                <w:color w:val="FFFFFF"/>
-                <w:sz w:val="18"/>
-              </w:rPr>
-              <w:t>Умолчание</w:t>
-            </w:r>
-          </w:p>
-        </w:tc>
-        <w:tc>
-          <w:tcPr>
-            <w:tcW w:type="dxa" w:w="4535"/>
-            <w:shd w:val="clear" w:color="auto" w:fill="4F6AFF"/>
-            <w:tcBorders>
-              <w:top w:val="single" w:sz="4" w:color="3A56F0"/>
-              <w:left w:val="single" w:sz="4" w:color="3A56F0"/>
-              <w:bottom w:val="single" w:sz="4" w:color="3A56F0"/>
-              <w:right w:val="single" w:sz="4" w:color="3A56F0"/>
-              <w:insideH w:val="single" w:sz="4" w:color="3A56F0"/>
-              <w:insideV w:val="single" w:sz="4" w:color="3A56F0"/>
-            </w:tcBorders>
-          </w:tcPr>
-          <w:p>
-            <w:pPr>
-              <w:jc w:val="left"/>
-            </w:pPr>
-            <w:r>
-              <w:rPr>
-                <w:b/>
-                <w:color w:val="FFFFFF"/>
-                <w:sz w:val="18"/>
-              </w:rPr>
-              <w:t>Описание</w:t>
-            </w:r>
-          </w:p>
-        </w:tc>
-      </w:tr>
-      <w:tr>
-        <w:tc>
-          <w:tcPr>
-            <w:tcW w:type="dxa" w:w="2551"/>
-            <w:shd w:val="clear" w:color="auto" w:fill="FFFFFF"/>
-            <w:tcBorders>
-              <w:top w:val="single" w:sz="4" w:color="E2E8F0"/>
-              <w:left w:val="single" w:sz="4" w:color="E2E8F0"/>
-              <w:bottom w:val="single" w:sz="4" w:color="E2E8F0"/>
-              <w:right w:val="single" w:sz="4" w:color="E2E8F0"/>
-              <w:insideH w:val="single" w:sz="4" w:color="E2E8F0"/>
-              <w:insideV w:val="single" w:sz="4" w:color="E2E8F0"/>
-            </w:tcBorders>
-          </w:tcPr>
-          <w:p>
-            <w:r>
-              <w:rPr>
-                <w:b/>
-                <w:color w:val="2D3A8C"/>
-                <w:sz w:val="18"/>
-              </w:rPr>
-              <w:t>overlayColor</w:t>
-            </w:r>
-          </w:p>
-        </w:tc>
-        <w:tc>
-          <w:tcPr>
-            <w:tcW w:type="dxa" w:w="1417"/>
-            <w:shd w:val="clear" w:color="auto" w:fill="FFFFFF"/>
-            <w:tcBorders>
-              <w:top w:val="single" w:sz="4" w:color="E2E8F0"/>
-              <w:left w:val="single" w:sz="4" w:color="E2E8F0"/>
-              <w:bottom w:val="single" w:sz="4" w:color="E2E8F0"/>
-              <w:right w:val="single" w:sz="4" w:color="E2E8F0"/>
-              <w:insideH w:val="single" w:sz="4" w:color="E2E8F0"/>
-              <w:insideV w:val="single" w:sz="4" w:color="E2E8F0"/>
-            </w:tcBorders>
-          </w:tcPr>
-          <w:p>
-            <w:r>
-              <w:rPr>
-                <w:color w:val="1E293B"/>
-                <w:sz w:val="18"/>
-              </w:rPr>
-              <w:t>String</w:t>
-            </w:r>
-          </w:p>
-        </w:tc>
-        <w:tc>
-          <w:tcPr>
-            <w:tcW w:type="dxa" w:w="1984"/>
-            <w:shd w:val="clear" w:color="auto" w:fill="FFFFFF"/>
-            <w:tcBorders>
-              <w:top w:val="single" w:sz="4" w:color="E2E8F0"/>
-              <w:left w:val="single" w:sz="4" w:color="E2E8F0"/>
-              <w:bottom w:val="single" w:sz="4" w:color="E2E8F0"/>
-              <w:right w:val="single" w:sz="4" w:color="E2E8F0"/>
-              <w:insideH w:val="single" w:sz="4" w:color="E2E8F0"/>
-              <w:insideV w:val="single" w:sz="4" w:color="E2E8F0"/>
-            </w:tcBorders>
-          </w:tcPr>
-          <w:p>
-            <w:r>
-              <w:rPr>
-                <w:color w:val="1E293B"/>
-                <w:sz w:val="18"/>
-              </w:rPr>
-              <w:t>#000000</w:t>
-            </w:r>
-          </w:p>
-        </w:tc>
-        <w:tc>
-          <w:tcPr>
-            <w:tcW w:type="dxa" w:w="4535"/>
-            <w:shd w:val="clear" w:color="auto" w:fill="FFFFFF"/>
-            <w:tcBorders>
-              <w:top w:val="single" w:sz="4" w:color="E2E8F0"/>
-              <w:left w:val="single" w:sz="4" w:color="E2E8F0"/>
-              <w:bottom w:val="single" w:sz="4" w:color="E2E8F0"/>
-              <w:right w:val="single" w:sz="4" w:color="E2E8F0"/>
-              <w:insideH w:val="single" w:sz="4" w:color="E2E8F0"/>
-              <w:insideV w:val="single" w:sz="4" w:color="E2E8F0"/>
-            </w:tcBorders>
-          </w:tcPr>
-          <w:p>
-            <w:r>
-              <w:rPr>
-                <w:color w:val="1E293B"/>
-                <w:sz w:val="18"/>
-              </w:rPr>
-              <w:t>Цвет затемняющей подложки</w:t>
-            </w:r>
-          </w:p>
-        </w:tc>
-      </w:tr>
-      <w:tr>
-        <w:tc>
-          <w:tcPr>
-            <w:tcW w:type="dxa" w:w="2551"/>
-            <w:shd w:val="clear" w:color="auto" w:fill="F8FAFC"/>
-            <w:tcBorders>
-              <w:top w:val="single" w:sz="4" w:color="E2E8F0"/>
-              <w:left w:val="single" w:sz="4" w:color="E2E8F0"/>
-              <w:bottom w:val="single" w:sz="4" w:color="E2E8F0"/>
-              <w:right w:val="single" w:sz="4" w:color="E2E8F0"/>
-              <w:insideH w:val="single" w:sz="4" w:color="E2E8F0"/>
-              <w:insideV w:val="single" w:sz="4" w:color="E2E8F0"/>
-            </w:tcBorders>
-          </w:tcPr>
-          <w:p>
-            <w:r>
-              <w:rPr>
-                <w:b/>
-                <w:color w:val="2D3A8C"/>
-                <w:sz w:val="18"/>
-              </w:rPr>
-              <w:t>overlayOpacity</w:t>
-            </w:r>
-          </w:p>
-        </w:tc>
-        <w:tc>
-          <w:tcPr>
-            <w:tcW w:type="dxa" w:w="1417"/>
-            <w:shd w:val="clear" w:color="auto" w:fill="F8FAFC"/>
-            <w:tcBorders>
-              <w:top w:val="single" w:sz="4" w:color="E2E8F0"/>
-              <w:left w:val="single" w:sz="4" w:color="E2E8F0"/>
-              <w:bottom w:val="single" w:sz="4" w:color="E2E8F0"/>
-              <w:right w:val="single" w:sz="4" w:color="E2E8F0"/>
-              <w:insideH w:val="single" w:sz="4" w:color="E2E8F0"/>
-              <w:insideV w:val="single" w:sz="4" w:color="E2E8F0"/>
-            </w:tcBorders>
-          </w:tcPr>
-          <w:p>
-            <w:r>
-              <w:rPr>
-                <w:color w:val="1E293B"/>
-                <w:sz w:val="18"/>
-              </w:rPr>
-              <w:t>Number</w:t>
-            </w:r>
-          </w:p>
-        </w:tc>
-        <w:tc>
-          <w:tcPr>
-            <w:tcW w:type="dxa" w:w="1984"/>
-            <w:shd w:val="clear" w:color="auto" w:fill="F8FAFC"/>
-            <w:tcBorders>
-              <w:top w:val="single" w:sz="4" w:color="E2E8F0"/>
-              <w:left w:val="single" w:sz="4" w:color="E2E8F0"/>
-              <w:bottom w:val="single" w:sz="4" w:color="E2E8F0"/>
-              <w:right w:val="single" w:sz="4" w:color="E2E8F0"/>
-              <w:insideH w:val="single" w:sz="4" w:color="E2E8F0"/>
-              <w:insideV w:val="single" w:sz="4" w:color="E2E8F0"/>
-            </w:tcBorders>
-          </w:tcPr>
-          <w:p>
-            <w:r>
-              <w:rPr>
-                <w:color w:val="1E293B"/>
-                <w:sz w:val="18"/>
-              </w:rPr>
-              <w:t>45</w:t>
-            </w:r>
-          </w:p>
-        </w:tc>
-        <w:tc>
-          <w:tcPr>
-            <w:tcW w:type="dxa" w:w="4535"/>
-            <w:shd w:val="clear" w:color="auto" w:fill="F8FAFC"/>
-            <w:tcBorders>
-              <w:top w:val="single" w:sz="4" w:color="E2E8F0"/>
-              <w:left w:val="single" w:sz="4" w:color="E2E8F0"/>
-              <w:bottom w:val="single" w:sz="4" w:color="E2E8F0"/>
-              <w:right w:val="single" w:sz="4" w:color="E2E8F0"/>
-              <w:insideH w:val="single" w:sz="4" w:color="E2E8F0"/>
-              <w:insideV w:val="single" w:sz="4" w:color="E2E8F0"/>
-            </w:tcBorders>
-          </w:tcPr>
-          <w:p>
-            <w:r>
-              <w:rPr>
-                <w:color w:val="1E293B"/>
-                <w:sz w:val="18"/>
-              </w:rPr>
-              <w:t>Непрозрачность подложки (%)</w:t>
-            </w:r>
-          </w:p>
-        </w:tc>
-      </w:tr>
-      <w:tr>
-        <w:tc>
-          <w:tcPr>
-            <w:tcW w:type="dxa" w:w="2551"/>
-            <w:shd w:val="clear" w:color="auto" w:fill="FFFFFF"/>
-            <w:tcBorders>
-              <w:top w:val="single" w:sz="4" w:color="E2E8F0"/>
-              <w:left w:val="single" w:sz="4" w:color="E2E8F0"/>
-              <w:bottom w:val="single" w:sz="4" w:color="E2E8F0"/>
-              <w:right w:val="single" w:sz="4" w:color="E2E8F0"/>
-              <w:insideH w:val="single" w:sz="4" w:color="E2E8F0"/>
-              <w:insideV w:val="single" w:sz="4" w:color="E2E8F0"/>
-            </w:tcBorders>
-          </w:tcPr>
-          <w:p>
-            <w:r>
-              <w:rPr>
-                <w:b/>
-                <w:color w:val="2D3A8C"/>
-                <w:sz w:val="18"/>
-              </w:rPr>
-              <w:t>dialogBgColor</w:t>
-            </w:r>
-          </w:p>
-        </w:tc>
-        <w:tc>
-          <w:tcPr>
-            <w:tcW w:type="dxa" w:w="1417"/>
-            <w:shd w:val="clear" w:color="auto" w:fill="FFFFFF"/>
-            <w:tcBorders>
-              <w:top w:val="single" w:sz="4" w:color="E2E8F0"/>
-              <w:left w:val="single" w:sz="4" w:color="E2E8F0"/>
-              <w:bottom w:val="single" w:sz="4" w:color="E2E8F0"/>
-              <w:right w:val="single" w:sz="4" w:color="E2E8F0"/>
-              <w:insideH w:val="single" w:sz="4" w:color="E2E8F0"/>
-              <w:insideV w:val="single" w:sz="4" w:color="E2E8F0"/>
-            </w:tcBorders>
-          </w:tcPr>
-          <w:p>
-            <w:r>
-              <w:rPr>
-                <w:color w:val="1E293B"/>
-                <w:sz w:val="18"/>
-              </w:rPr>
-              <w:t>String</w:t>
-            </w:r>
-          </w:p>
-        </w:tc>
-        <w:tc>
-          <w:tcPr>
-            <w:tcW w:type="dxa" w:w="1984"/>
-            <w:shd w:val="clear" w:color="auto" w:fill="FFFFFF"/>
-            <w:tcBorders>
-              <w:top w:val="single" w:sz="4" w:color="E2E8F0"/>
-              <w:left w:val="single" w:sz="4" w:color="E2E8F0"/>
-              <w:bottom w:val="single" w:sz="4" w:color="E2E8F0"/>
-              <w:right w:val="single" w:sz="4" w:color="E2E8F0"/>
-              <w:insideH w:val="single" w:sz="4" w:color="E2E8F0"/>
-              <w:insideV w:val="single" w:sz="4" w:color="E2E8F0"/>
-            </w:tcBorders>
-          </w:tcPr>
-          <w:p>
-            <w:r>
-              <w:rPr>
-                <w:color w:val="1E293B"/>
-                <w:sz w:val="18"/>
-              </w:rPr>
-              <w:t>''</w:t>
-            </w:r>
-          </w:p>
-        </w:tc>
-        <w:tc>
-          <w:tcPr>
-            <w:tcW w:type="dxa" w:w="4535"/>
-            <w:shd w:val="clear" w:color="auto" w:fill="FFFFFF"/>
-            <w:tcBorders>
-              <w:top w:val="single" w:sz="4" w:color="E2E8F0"/>
-              <w:left w:val="single" w:sz="4" w:color="E2E8F0"/>
-              <w:bottom w:val="single" w:sz="4" w:color="E2E8F0"/>
-              <w:right w:val="single" w:sz="4" w:color="E2E8F0"/>
-              <w:insideH w:val="single" w:sz="4" w:color="E2E8F0"/>
-              <w:insideV w:val="single" w:sz="4" w:color="E2E8F0"/>
-            </w:tcBorders>
-          </w:tcPr>
-          <w:p>
-            <w:r>
-              <w:rPr>
-                <w:color w:val="1E293B"/>
-                <w:sz w:val="18"/>
-              </w:rPr>
-              <w:t>Фон диалогового окна</w:t>
-            </w:r>
-          </w:p>
-        </w:tc>
-      </w:tr>
-      <w:tr>
-        <w:tc>
-          <w:tcPr>
-            <w:tcW w:type="dxa" w:w="2551"/>
-            <w:shd w:val="clear" w:color="auto" w:fill="F8FAFC"/>
-            <w:tcBorders>
-              <w:top w:val="single" w:sz="4" w:color="E2E8F0"/>
-              <w:left w:val="single" w:sz="4" w:color="E2E8F0"/>
-              <w:bottom w:val="single" w:sz="4" w:color="E2E8F0"/>
-              <w:right w:val="single" w:sz="4" w:color="E2E8F0"/>
-              <w:insideH w:val="single" w:sz="4" w:color="E2E8F0"/>
-              <w:insideV w:val="single" w:sz="4" w:color="E2E8F0"/>
-            </w:tcBorders>
-          </w:tcPr>
-          <w:p>
-            <w:r>
-              <w:rPr>
-                <w:b/>
-                <w:color w:val="2D3A8C"/>
-                <w:sz w:val="18"/>
-              </w:rPr>
-              <w:t>dialogTextColor</w:t>
-            </w:r>
-          </w:p>
-        </w:tc>
-        <w:tc>
-          <w:tcPr>
-            <w:tcW w:type="dxa" w:w="1417"/>
-            <w:shd w:val="clear" w:color="auto" w:fill="F8FAFC"/>
-            <w:tcBorders>
-              <w:top w:val="single" w:sz="4" w:color="E2E8F0"/>
-              <w:left w:val="single" w:sz="4" w:color="E2E8F0"/>
-              <w:bottom w:val="single" w:sz="4" w:color="E2E8F0"/>
-              <w:right w:val="single" w:sz="4" w:color="E2E8F0"/>
-              <w:insideH w:val="single" w:sz="4" w:color="E2E8F0"/>
-              <w:insideV w:val="single" w:sz="4" w:color="E2E8F0"/>
-            </w:tcBorders>
-          </w:tcPr>
-          <w:p>
-            <w:r>
-              <w:rPr>
-                <w:color w:val="1E293B"/>
-                <w:sz w:val="18"/>
-              </w:rPr>
-              <w:t>String</w:t>
-            </w:r>
-          </w:p>
-        </w:tc>
-        <w:tc>
-          <w:tcPr>
-            <w:tcW w:type="dxa" w:w="1984"/>
-            <w:shd w:val="clear" w:color="auto" w:fill="F8FAFC"/>
-            <w:tcBorders>
-              <w:top w:val="single" w:sz="4" w:color="E2E8F0"/>
-              <w:left w:val="single" w:sz="4" w:color="E2E8F0"/>
-              <w:bottom w:val="single" w:sz="4" w:color="E2E8F0"/>
-              <w:right w:val="single" w:sz="4" w:color="E2E8F0"/>
-              <w:insideH w:val="single" w:sz="4" w:color="E2E8F0"/>
-              <w:insideV w:val="single" w:sz="4" w:color="E2E8F0"/>
-            </w:tcBorders>
-          </w:tcPr>
-          <w:p>
-            <w:r>
-              <w:rPr>
-                <w:color w:val="1E293B"/>
-                <w:sz w:val="18"/>
-              </w:rPr>
-              <w:t>''</w:t>
-            </w:r>
-          </w:p>
-        </w:tc>
-        <w:tc>
-          <w:tcPr>
-            <w:tcW w:type="dxa" w:w="4535"/>
-            <w:shd w:val="clear" w:color="auto" w:fill="F8FAFC"/>
-            <w:tcBorders>
-              <w:top w:val="single" w:sz="4" w:color="E2E8F0"/>
-              <w:left w:val="single" w:sz="4" w:color="E2E8F0"/>
-              <w:bottom w:val="single" w:sz="4" w:color="E2E8F0"/>
-              <w:right w:val="single" w:sz="4" w:color="E2E8F0"/>
-              <w:insideH w:val="single" w:sz="4" w:color="E2E8F0"/>
-              <w:insideV w:val="single" w:sz="4" w:color="E2E8F0"/>
-            </w:tcBorders>
-          </w:tcPr>
-          <w:p>
-            <w:r>
-              <w:rPr>
-                <w:color w:val="1E293B"/>
-                <w:sz w:val="18"/>
-              </w:rPr>
-              <w:t>Цвет текста диалога</w:t>
-            </w:r>
-          </w:p>
-        </w:tc>
-      </w:tr>
-      <w:tr>
-        <w:tc>
-          <w:tcPr>
-            <w:tcW w:type="dxa" w:w="2551"/>
-            <w:shd w:val="clear" w:color="auto" w:fill="FFFFFF"/>
-            <w:tcBorders>
-              <w:top w:val="single" w:sz="4" w:color="E2E8F0"/>
-              <w:left w:val="single" w:sz="4" w:color="E2E8F0"/>
-              <w:bottom w:val="single" w:sz="4" w:color="E2E8F0"/>
-              <w:right w:val="single" w:sz="4" w:color="E2E8F0"/>
-              <w:insideH w:val="single" w:sz="4" w:color="E2E8F0"/>
-              <w:insideV w:val="single" w:sz="4" w:color="E2E8F0"/>
-            </w:tcBorders>
-          </w:tcPr>
-          <w:p>
-            <w:r>
-              <w:rPr>
-                <w:b/>
-                <w:color w:val="2D3A8C"/>
-                <w:sz w:val="18"/>
-              </w:rPr>
-              <w:t>dialogRadius</w:t>
-            </w:r>
-          </w:p>
-        </w:tc>
-        <w:tc>
-          <w:tcPr>
-            <w:tcW w:type="dxa" w:w="1417"/>
-            <w:shd w:val="clear" w:color="auto" w:fill="FFFFFF"/>
-            <w:tcBorders>
-              <w:top w:val="single" w:sz="4" w:color="E2E8F0"/>
-              <w:left w:val="single" w:sz="4" w:color="E2E8F0"/>
-              <w:bottom w:val="single" w:sz="4" w:color="E2E8F0"/>
-              <w:right w:val="single" w:sz="4" w:color="E2E8F0"/>
-              <w:insideH w:val="single" w:sz="4" w:color="E2E8F0"/>
-              <w:insideV w:val="single" w:sz="4" w:color="E2E8F0"/>
-            </w:tcBorders>
-          </w:tcPr>
-          <w:p>
-            <w:r>
-              <w:rPr>
-                <w:color w:val="1E293B"/>
-                <w:sz w:val="18"/>
-              </w:rPr>
-              <w:t>Number</w:t>
-            </w:r>
-          </w:p>
-        </w:tc>
-        <w:tc>
-          <w:tcPr>
-            <w:tcW w:type="dxa" w:w="1984"/>
-            <w:shd w:val="clear" w:color="auto" w:fill="FFFFFF"/>
-            <w:tcBorders>
-              <w:top w:val="single" w:sz="4" w:color="E2E8F0"/>
-              <w:left w:val="single" w:sz="4" w:color="E2E8F0"/>
-              <w:bottom w:val="single" w:sz="4" w:color="E2E8F0"/>
-              <w:right w:val="single" w:sz="4" w:color="E2E8F0"/>
-              <w:insideH w:val="single" w:sz="4" w:color="E2E8F0"/>
-              <w:insideV w:val="single" w:sz="4" w:color="E2E8F0"/>
-            </w:tcBorders>
-          </w:tcPr>
-          <w:p>
-            <w:r>
-              <w:rPr>
-                <w:color w:val="1E293B"/>
-                <w:sz w:val="18"/>
-              </w:rPr>
-              <w:t>8</w:t>
-            </w:r>
-          </w:p>
-        </w:tc>
-        <w:tc>
-          <w:tcPr>
-            <w:tcW w:type="dxa" w:w="4535"/>
-            <w:shd w:val="clear" w:color="auto" w:fill="FFFFFF"/>
-            <w:tcBorders>
-              <w:top w:val="single" w:sz="4" w:color="E2E8F0"/>
-              <w:left w:val="single" w:sz="4" w:color="E2E8F0"/>
-              <w:bottom w:val="single" w:sz="4" w:color="E2E8F0"/>
-              <w:right w:val="single" w:sz="4" w:color="E2E8F0"/>
-              <w:insideH w:val="single" w:sz="4" w:color="E2E8F0"/>
-              <w:insideV w:val="single" w:sz="4" w:color="E2E8F0"/>
-            </w:tcBorders>
-          </w:tcPr>
-          <w:p>
-            <w:r>
-              <w:rPr>
-                <w:color w:val="1E293B"/>
-                <w:sz w:val="18"/>
-              </w:rPr>
-              <w:t>Скругление окна (px)</w:t>
-            </w:r>
-          </w:p>
-        </w:tc>
-      </w:tr>
-      <w:tr>
-        <w:tc>
-          <w:tcPr>
-            <w:tcW w:type="dxa" w:w="2551"/>
-            <w:shd w:val="clear" w:color="auto" w:fill="F8FAFC"/>
-            <w:tcBorders>
-              <w:top w:val="single" w:sz="4" w:color="E2E8F0"/>
-              <w:left w:val="single" w:sz="4" w:color="E2E8F0"/>
-              <w:bottom w:val="single" w:sz="4" w:color="E2E8F0"/>
-              <w:right w:val="single" w:sz="4" w:color="E2E8F0"/>
-              <w:insideH w:val="single" w:sz="4" w:color="E2E8F0"/>
-              <w:insideV w:val="single" w:sz="4" w:color="E2E8F0"/>
-            </w:tcBorders>
-          </w:tcPr>
-          <w:p>
-            <w:r>
-              <w:rPr>
-                <w:b/>
-                <w:color w:val="2D3A8C"/>
-                <w:sz w:val="18"/>
-              </w:rPr>
-              <w:t>dialogMaxWidth</w:t>
-            </w:r>
-          </w:p>
-        </w:tc>
-        <w:tc>
-          <w:tcPr>
-            <w:tcW w:type="dxa" w:w="1417"/>
-            <w:shd w:val="clear" w:color="auto" w:fill="F8FAFC"/>
-            <w:tcBorders>
-              <w:top w:val="single" w:sz="4" w:color="E2E8F0"/>
-              <w:left w:val="single" w:sz="4" w:color="E2E8F0"/>
-              <w:bottom w:val="single" w:sz="4" w:color="E2E8F0"/>
-              <w:right w:val="single" w:sz="4" w:color="E2E8F0"/>
-              <w:insideH w:val="single" w:sz="4" w:color="E2E8F0"/>
-              <w:insideV w:val="single" w:sz="4" w:color="E2E8F0"/>
-            </w:tcBorders>
-          </w:tcPr>
-          <w:p>
-            <w:r>
-              <w:rPr>
-                <w:color w:val="1E293B"/>
-                <w:sz w:val="18"/>
-              </w:rPr>
-              <w:t>Number</w:t>
-            </w:r>
-          </w:p>
-        </w:tc>
-        <w:tc>
-          <w:tcPr>
-            <w:tcW w:type="dxa" w:w="1984"/>
-            <w:shd w:val="clear" w:color="auto" w:fill="F8FAFC"/>
-            <w:tcBorders>
-              <w:top w:val="single" w:sz="4" w:color="E2E8F0"/>
-              <w:left w:val="single" w:sz="4" w:color="E2E8F0"/>
-              <w:bottom w:val="single" w:sz="4" w:color="E2E8F0"/>
-              <w:right w:val="single" w:sz="4" w:color="E2E8F0"/>
-              <w:insideH w:val="single" w:sz="4" w:color="E2E8F0"/>
-              <w:insideV w:val="single" w:sz="4" w:color="E2E8F0"/>
-            </w:tcBorders>
-          </w:tcPr>
-          <w:p>
-            <w:r>
-              <w:rPr>
-                <w:color w:val="1E293B"/>
-                <w:sz w:val="18"/>
-              </w:rPr>
-              <w:t>380</w:t>
-            </w:r>
-          </w:p>
-        </w:tc>
-        <w:tc>
-          <w:tcPr>
-            <w:tcW w:type="dxa" w:w="4535"/>
-            <w:shd w:val="clear" w:color="auto" w:fill="F8FAFC"/>
-            <w:tcBorders>
-              <w:top w:val="single" w:sz="4" w:color="E2E8F0"/>
-              <w:left w:val="single" w:sz="4" w:color="E2E8F0"/>
-              <w:bottom w:val="single" w:sz="4" w:color="E2E8F0"/>
-              <w:right w:val="single" w:sz="4" w:color="E2E8F0"/>
-              <w:insideH w:val="single" w:sz="4" w:color="E2E8F0"/>
-              <w:insideV w:val="single" w:sz="4" w:color="E2E8F0"/>
-            </w:tcBorders>
-          </w:tcPr>
-          <w:p>
-            <w:r>
-              <w:rPr>
-                <w:color w:val="1E293B"/>
-                <w:sz w:val="18"/>
-              </w:rPr>
-              <w:t>Максимальная ширина диалога (px)</w:t>
-            </w:r>
-          </w:p>
-        </w:tc>
-      </w:tr>
-      <w:tr>
-        <w:tc>
-          <w:tcPr>
-            <w:tcW w:type="dxa" w:w="2551"/>
-            <w:shd w:val="clear" w:color="auto" w:fill="FFFFFF"/>
-            <w:tcBorders>
-              <w:top w:val="single" w:sz="4" w:color="E2E8F0"/>
-              <w:left w:val="single" w:sz="4" w:color="E2E8F0"/>
-              <w:bottom w:val="single" w:sz="4" w:color="E2E8F0"/>
-              <w:right w:val="single" w:sz="4" w:color="E2E8F0"/>
-              <w:insideH w:val="single" w:sz="4" w:color="E2E8F0"/>
-              <w:insideV w:val="single" w:sz="4" w:color="E2E8F0"/>
-            </w:tcBorders>
-          </w:tcPr>
-          <w:p>
-            <w:r>
-              <w:rPr>
-                <w:b/>
-                <w:color w:val="2D3A8C"/>
-                <w:sz w:val="18"/>
-              </w:rPr>
-              <w:t>iconColor</w:t>
-            </w:r>
-          </w:p>
-        </w:tc>
-        <w:tc>
-          <w:tcPr>
-            <w:tcW w:type="dxa" w:w="1417"/>
-            <w:shd w:val="clear" w:color="auto" w:fill="FFFFFF"/>
-            <w:tcBorders>
-              <w:top w:val="single" w:sz="4" w:color="E2E8F0"/>
-              <w:left w:val="single" w:sz="4" w:color="E2E8F0"/>
-              <w:bottom w:val="single" w:sz="4" w:color="E2E8F0"/>
-              <w:right w:val="single" w:sz="4" w:color="E2E8F0"/>
-              <w:insideH w:val="single" w:sz="4" w:color="E2E8F0"/>
-              <w:insideV w:val="single" w:sz="4" w:color="E2E8F0"/>
-            </w:tcBorders>
-          </w:tcPr>
-          <w:p>
-            <w:r>
-              <w:rPr>
-                <w:color w:val="1E293B"/>
-                <w:sz w:val="18"/>
-              </w:rPr>
-              <w:t>String</w:t>
-            </w:r>
-          </w:p>
-        </w:tc>
-        <w:tc>
-          <w:tcPr>
-            <w:tcW w:type="dxa" w:w="1984"/>
-            <w:shd w:val="clear" w:color="auto" w:fill="FFFFFF"/>
-            <w:tcBorders>
-              <w:top w:val="single" w:sz="4" w:color="E2E8F0"/>
-              <w:left w:val="single" w:sz="4" w:color="E2E8F0"/>
-              <w:bottom w:val="single" w:sz="4" w:color="E2E8F0"/>
-              <w:right w:val="single" w:sz="4" w:color="E2E8F0"/>
-              <w:insideH w:val="single" w:sz="4" w:color="E2E8F0"/>
-              <w:insideV w:val="single" w:sz="4" w:color="E2E8F0"/>
-            </w:tcBorders>
-          </w:tcPr>
-          <w:p>
-            <w:r>
-              <w:rPr>
-                <w:color w:val="1E293B"/>
-                <w:sz w:val="18"/>
-              </w:rPr>
-              <w:t>''</w:t>
-            </w:r>
-          </w:p>
-        </w:tc>
-        <w:tc>
-          <w:tcPr>
-            <w:tcW w:type="dxa" w:w="4535"/>
-            <w:shd w:val="clear" w:color="auto" w:fill="FFFFFF"/>
-            <w:tcBorders>
-              <w:top w:val="single" w:sz="4" w:color="E2E8F0"/>
-              <w:left w:val="single" w:sz="4" w:color="E2E8F0"/>
-              <w:bottom w:val="single" w:sz="4" w:color="E2E8F0"/>
-              <w:right w:val="single" w:sz="4" w:color="E2E8F0"/>
-              <w:insideH w:val="single" w:sz="4" w:color="E2E8F0"/>
-              <w:insideV w:val="single" w:sz="4" w:color="E2E8F0"/>
-            </w:tcBorders>
-          </w:tcPr>
-          <w:p>
-            <w:r>
-              <w:rPr>
-                <w:color w:val="1E293B"/>
-                <w:sz w:val="18"/>
-              </w:rPr>
-              <w:t>Цвет иконки в диалоге</w:t>
-            </w:r>
-          </w:p>
-        </w:tc>
-      </w:tr>
-      <w:tr>
-        <w:tc>
-          <w:tcPr>
-            <w:tcW w:type="dxa" w:w="2551"/>
-            <w:shd w:val="clear" w:color="auto" w:fill="F8FAFC"/>
-            <w:tcBorders>
-              <w:top w:val="single" w:sz="4" w:color="E2E8F0"/>
-              <w:left w:val="single" w:sz="4" w:color="E2E8F0"/>
-              <w:bottom w:val="single" w:sz="4" w:color="E2E8F0"/>
-              <w:right w:val="single" w:sz="4" w:color="E2E8F0"/>
-              <w:insideH w:val="single" w:sz="4" w:color="E2E8F0"/>
-              <w:insideV w:val="single" w:sz="4" w:color="E2E8F0"/>
-            </w:tcBorders>
-          </w:tcPr>
-          <w:p>
-            <w:r>
-              <w:rPr>
-                <w:b/>
-                <w:color w:val="2D3A8C"/>
-                <w:sz w:val="18"/>
-              </w:rPr>
-              <w:t>fontFamily</w:t>
-            </w:r>
-          </w:p>
-        </w:tc>
-        <w:tc>
-          <w:tcPr>
-            <w:tcW w:type="dxa" w:w="1417"/>
-            <w:shd w:val="clear" w:color="auto" w:fill="F8FAFC"/>
-            <w:tcBorders>
-              <w:top w:val="single" w:sz="4" w:color="E2E8F0"/>
-              <w:left w:val="single" w:sz="4" w:color="E2E8F0"/>
-              <w:bottom w:val="single" w:sz="4" w:color="E2E8F0"/>
-              <w:right w:val="single" w:sz="4" w:color="E2E8F0"/>
-              <w:insideH w:val="single" w:sz="4" w:color="E2E8F0"/>
-              <w:insideV w:val="single" w:sz="4" w:color="E2E8F0"/>
-            </w:tcBorders>
-          </w:tcPr>
-          <w:p>
-            <w:r>
-              <w:rPr>
-                <w:color w:val="1E293B"/>
-                <w:sz w:val="18"/>
-              </w:rPr>
-              <w:t>String</w:t>
-            </w:r>
-          </w:p>
-        </w:tc>
-        <w:tc>
-          <w:tcPr>
-            <w:tcW w:type="dxa" w:w="1984"/>
-            <w:shd w:val="clear" w:color="auto" w:fill="F8FAFC"/>
-            <w:tcBorders>
-              <w:top w:val="single" w:sz="4" w:color="E2E8F0"/>
-              <w:left w:val="single" w:sz="4" w:color="E2E8F0"/>
-              <w:bottom w:val="single" w:sz="4" w:color="E2E8F0"/>
-              <w:right w:val="single" w:sz="4" w:color="E2E8F0"/>
-              <w:insideH w:val="single" w:sz="4" w:color="E2E8F0"/>
-              <w:insideV w:val="single" w:sz="4" w:color="E2E8F0"/>
-            </w:tcBorders>
-          </w:tcPr>
-          <w:p>
-            <w:r>
-              <w:rPr>
-                <w:color w:val="1E293B"/>
-                <w:sz w:val="18"/>
-              </w:rPr>
-              <w:t>''</w:t>
-            </w:r>
-          </w:p>
-        </w:tc>
-        <w:tc>
-          <w:tcPr>
-            <w:tcW w:type="dxa" w:w="4535"/>
-            <w:shd w:val="clear" w:color="auto" w:fill="F8FAFC"/>
-            <w:tcBorders>
-              <w:top w:val="single" w:sz="4" w:color="E2E8F0"/>
-              <w:left w:val="single" w:sz="4" w:color="E2E8F0"/>
-              <w:bottom w:val="single" w:sz="4" w:color="E2E8F0"/>
-              <w:right w:val="single" w:sz="4" w:color="E2E8F0"/>
-              <w:insideH w:val="single" w:sz="4" w:color="E2E8F0"/>
-              <w:insideV w:val="single" w:sz="4" w:color="E2E8F0"/>
-            </w:tcBorders>
-          </w:tcPr>
-          <w:p>
-            <w:r>
-              <w:rPr>
-                <w:color w:val="1E293B"/>
-                <w:sz w:val="18"/>
-              </w:rPr>
-              <w:t>Гарнитура шрифта диалога</w:t>
-            </w:r>
-          </w:p>
-        </w:tc>
-      </w:tr>
-    </w:tbl>
-    <w:p/>
-    <w:p>
-      <w:r>
-        <w:rPr>
-          <w:b/>
-          <w:color w:val="1E293B"/>
-          <w:sz w:val="22"/>
-        </w:rPr>
-        <w:t>Оформление кнопки</w:t>
-      </w:r>
-    </w:p>
-    <w:tbl>
-      <w:tblPr>
-        <w:tblW w:type="auto" w:w="0"/>
-        <w:jc w:val="left"/>
-        <w:tblLook w:firstColumn="1" w:firstRow="1" w:lastColumn="0" w:lastRow="0" w:noHBand="0" w:noVBand="1" w:val="04A0"/>
-      </w:tblPr>
-      <w:tblGrid>
-        <w:gridCol w:w="2351"/>
-        <w:gridCol w:w="2351"/>
-        <w:gridCol w:w="2351"/>
-        <w:gridCol w:w="2351"/>
-      </w:tblGrid>
-      <w:tr>
-        <w:tc>
-          <w:tcPr>
-            <w:tcW w:type="dxa" w:w="2551"/>
-            <w:shd w:val="clear" w:color="auto" w:fill="4F6AFF"/>
-            <w:tcBorders>
-              <w:top w:val="single" w:sz="4" w:color="3A56F0"/>
-              <w:left w:val="single" w:sz="4" w:color="3A56F0"/>
-              <w:bottom w:val="single" w:sz="4" w:color="3A56F0"/>
-              <w:right w:val="single" w:sz="4" w:color="3A56F0"/>
-              <w:insideH w:val="single" w:sz="4" w:color="3A56F0"/>
-              <w:insideV w:val="single" w:sz="4" w:color="3A56F0"/>
-            </w:tcBorders>
-          </w:tcPr>
-          <w:p>
-            <w:pPr>
-              <w:jc w:val="left"/>
-            </w:pPr>
-            <w:r>
-              <w:rPr>
-                <w:b/>
-                <w:color w:val="FFFFFF"/>
-                <w:sz w:val="18"/>
-              </w:rPr>
-              <w:t>Параметр</w:t>
-            </w:r>
-          </w:p>
-        </w:tc>
-        <w:tc>
-          <w:tcPr>
-            <w:tcW w:type="dxa" w:w="1417"/>
-            <w:shd w:val="clear" w:color="auto" w:fill="4F6AFF"/>
-            <w:tcBorders>
-              <w:top w:val="single" w:sz="4" w:color="3A56F0"/>
-              <w:left w:val="single" w:sz="4" w:color="3A56F0"/>
-              <w:bottom w:val="single" w:sz="4" w:color="3A56F0"/>
-              <w:right w:val="single" w:sz="4" w:color="3A56F0"/>
-              <w:insideH w:val="single" w:sz="4" w:color="3A56F0"/>
-              <w:insideV w:val="single" w:sz="4" w:color="3A56F0"/>
-            </w:tcBorders>
-          </w:tcPr>
-          <w:p>
-            <w:pPr>
-              <w:jc w:val="left"/>
-            </w:pPr>
-            <w:r>
-              <w:rPr>
-                <w:b/>
-                <w:color w:val="FFFFFF"/>
-                <w:sz w:val="18"/>
-              </w:rPr>
-              <w:t>Тип</w:t>
-            </w:r>
-          </w:p>
-        </w:tc>
-        <w:tc>
-          <w:tcPr>
-            <w:tcW w:type="dxa" w:w="1984"/>
-            <w:shd w:val="clear" w:color="auto" w:fill="4F6AFF"/>
-            <w:tcBorders>
-              <w:top w:val="single" w:sz="4" w:color="3A56F0"/>
-              <w:left w:val="single" w:sz="4" w:color="3A56F0"/>
-              <w:bottom w:val="single" w:sz="4" w:color="3A56F0"/>
-              <w:right w:val="single" w:sz="4" w:color="3A56F0"/>
-              <w:insideH w:val="single" w:sz="4" w:color="3A56F0"/>
-              <w:insideV w:val="single" w:sz="4" w:color="3A56F0"/>
-            </w:tcBorders>
-          </w:tcPr>
-          <w:p>
-            <w:pPr>
-              <w:jc w:val="left"/>
-            </w:pPr>
-            <w:r>
-              <w:rPr>
-                <w:b/>
-                <w:color w:val="FFFFFF"/>
-                <w:sz w:val="18"/>
-              </w:rPr>
-              <w:t>Умолчание</w:t>
-            </w:r>
-          </w:p>
-        </w:tc>
-        <w:tc>
-          <w:tcPr>
-            <w:tcW w:type="dxa" w:w="4535"/>
-            <w:shd w:val="clear" w:color="auto" w:fill="4F6AFF"/>
-            <w:tcBorders>
-              <w:top w:val="single" w:sz="4" w:color="3A56F0"/>
-              <w:left w:val="single" w:sz="4" w:color="3A56F0"/>
-              <w:bottom w:val="single" w:sz="4" w:color="3A56F0"/>
-              <w:right w:val="single" w:sz="4" w:color="3A56F0"/>
-              <w:insideH w:val="single" w:sz="4" w:color="3A56F0"/>
-              <w:insideV w:val="single" w:sz="4" w:color="3A56F0"/>
-            </w:tcBorders>
-          </w:tcPr>
-          <w:p>
-            <w:pPr>
-              <w:jc w:val="left"/>
-            </w:pPr>
-            <w:r>
-              <w:rPr>
-                <w:b/>
-                <w:color w:val="FFFFFF"/>
-                <w:sz w:val="18"/>
-              </w:rPr>
-              <w:t>Описание</w:t>
-            </w:r>
-          </w:p>
-        </w:tc>
-      </w:tr>
-      <w:tr>
-        <w:tc>
-          <w:tcPr>
-            <w:tcW w:type="dxa" w:w="2551"/>
-            <w:shd w:val="clear" w:color="auto" w:fill="FFFFFF"/>
-            <w:tcBorders>
-              <w:top w:val="single" w:sz="4" w:color="E2E8F0"/>
-              <w:left w:val="single" w:sz="4" w:color="E2E8F0"/>
-              <w:bottom w:val="single" w:sz="4" w:color="E2E8F0"/>
-              <w:right w:val="single" w:sz="4" w:color="E2E8F0"/>
-              <w:insideH w:val="single" w:sz="4" w:color="E2E8F0"/>
-              <w:insideV w:val="single" w:sz="4" w:color="E2E8F0"/>
-            </w:tcBorders>
-          </w:tcPr>
-          <w:p>
-            <w:r>
-              <w:rPr>
-                <w:b/>
-                <w:color w:val="2D3A8C"/>
-                <w:sz w:val="18"/>
-              </w:rPr>
-              <w:t>btnBgColor</w:t>
-            </w:r>
-          </w:p>
-        </w:tc>
-        <w:tc>
-          <w:tcPr>
-            <w:tcW w:type="dxa" w:w="1417"/>
-            <w:shd w:val="clear" w:color="auto" w:fill="FFFFFF"/>
-            <w:tcBorders>
-              <w:top w:val="single" w:sz="4" w:color="E2E8F0"/>
-              <w:left w:val="single" w:sz="4" w:color="E2E8F0"/>
-              <w:bottom w:val="single" w:sz="4" w:color="E2E8F0"/>
-              <w:right w:val="single" w:sz="4" w:color="E2E8F0"/>
-              <w:insideH w:val="single" w:sz="4" w:color="E2E8F0"/>
-              <w:insideV w:val="single" w:sz="4" w:color="E2E8F0"/>
-            </w:tcBorders>
-          </w:tcPr>
-          <w:p>
-            <w:r>
-              <w:rPr>
-                <w:color w:val="1E293B"/>
-                <w:sz w:val="18"/>
-              </w:rPr>
-              <w:t>String</w:t>
-            </w:r>
-          </w:p>
-        </w:tc>
-        <w:tc>
-          <w:tcPr>
-            <w:tcW w:type="dxa" w:w="1984"/>
-            <w:shd w:val="clear" w:color="auto" w:fill="FFFFFF"/>
-            <w:tcBorders>
-              <w:top w:val="single" w:sz="4" w:color="E2E8F0"/>
-              <w:left w:val="single" w:sz="4" w:color="E2E8F0"/>
-              <w:bottom w:val="single" w:sz="4" w:color="E2E8F0"/>
-              <w:right w:val="single" w:sz="4" w:color="E2E8F0"/>
-              <w:insideH w:val="single" w:sz="4" w:color="E2E8F0"/>
-              <w:insideV w:val="single" w:sz="4" w:color="E2E8F0"/>
-            </w:tcBorders>
-          </w:tcPr>
-          <w:p>
-            <w:r>
-              <w:rPr>
-                <w:color w:val="1E293B"/>
-                <w:sz w:val="18"/>
-              </w:rPr>
-              <w:t>''</w:t>
-            </w:r>
-          </w:p>
-        </w:tc>
-        <w:tc>
-          <w:tcPr>
-            <w:tcW w:type="dxa" w:w="4535"/>
-            <w:shd w:val="clear" w:color="auto" w:fill="FFFFFF"/>
-            <w:tcBorders>
-              <w:top w:val="single" w:sz="4" w:color="E2E8F0"/>
-              <w:left w:val="single" w:sz="4" w:color="E2E8F0"/>
-              <w:bottom w:val="single" w:sz="4" w:color="E2E8F0"/>
-              <w:right w:val="single" w:sz="4" w:color="E2E8F0"/>
-              <w:insideH w:val="single" w:sz="4" w:color="E2E8F0"/>
-              <w:insideV w:val="single" w:sz="4" w:color="E2E8F0"/>
-            </w:tcBorders>
-          </w:tcPr>
-          <w:p>
-            <w:r>
-              <w:rPr>
-                <w:color w:val="1E293B"/>
-                <w:sz w:val="18"/>
-              </w:rPr>
-              <w:t>Фон кнопки «Оставаться»</w:t>
-            </w:r>
-          </w:p>
-        </w:tc>
-      </w:tr>
-      <w:tr>
-        <w:tc>
-          <w:tcPr>
-            <w:tcW w:type="dxa" w:w="2551"/>
-            <w:shd w:val="clear" w:color="auto" w:fill="F8FAFC"/>
-            <w:tcBorders>
-              <w:top w:val="single" w:sz="4" w:color="E2E8F0"/>
-              <w:left w:val="single" w:sz="4" w:color="E2E8F0"/>
-              <w:bottom w:val="single" w:sz="4" w:color="E2E8F0"/>
-              <w:right w:val="single" w:sz="4" w:color="E2E8F0"/>
-              <w:insideH w:val="single" w:sz="4" w:color="E2E8F0"/>
-              <w:insideV w:val="single" w:sz="4" w:color="E2E8F0"/>
-            </w:tcBorders>
-          </w:tcPr>
-          <w:p>
-            <w:r>
-              <w:rPr>
-                <w:b/>
-                <w:color w:val="2D3A8C"/>
-                <w:sz w:val="18"/>
-              </w:rPr>
-              <w:t>btnTextColor</w:t>
-            </w:r>
-          </w:p>
-        </w:tc>
-        <w:tc>
-          <w:tcPr>
-            <w:tcW w:type="dxa" w:w="1417"/>
-            <w:shd w:val="clear" w:color="auto" w:fill="F8FAFC"/>
-            <w:tcBorders>
-              <w:top w:val="single" w:sz="4" w:color="E2E8F0"/>
-              <w:left w:val="single" w:sz="4" w:color="E2E8F0"/>
-              <w:bottom w:val="single" w:sz="4" w:color="E2E8F0"/>
-              <w:right w:val="single" w:sz="4" w:color="E2E8F0"/>
-              <w:insideH w:val="single" w:sz="4" w:color="E2E8F0"/>
-              <w:insideV w:val="single" w:sz="4" w:color="E2E8F0"/>
-            </w:tcBorders>
-          </w:tcPr>
-          <w:p>
-            <w:r>
-              <w:rPr>
-                <w:color w:val="1E293B"/>
-                <w:sz w:val="18"/>
-              </w:rPr>
-              <w:t>String</w:t>
-            </w:r>
-          </w:p>
-        </w:tc>
-        <w:tc>
-          <w:tcPr>
-            <w:tcW w:type="dxa" w:w="1984"/>
-            <w:shd w:val="clear" w:color="auto" w:fill="F8FAFC"/>
-            <w:tcBorders>
-              <w:top w:val="single" w:sz="4" w:color="E2E8F0"/>
-              <w:left w:val="single" w:sz="4" w:color="E2E8F0"/>
-              <w:bottom w:val="single" w:sz="4" w:color="E2E8F0"/>
-              <w:right w:val="single" w:sz="4" w:color="E2E8F0"/>
-              <w:insideH w:val="single" w:sz="4" w:color="E2E8F0"/>
-              <w:insideV w:val="single" w:sz="4" w:color="E2E8F0"/>
-            </w:tcBorders>
-          </w:tcPr>
-          <w:p>
-            <w:r>
-              <w:rPr>
-                <w:color w:val="1E293B"/>
-                <w:sz w:val="18"/>
-              </w:rPr>
-              <w:t>''</w:t>
-            </w:r>
-          </w:p>
-        </w:tc>
-        <w:tc>
-          <w:tcPr>
-            <w:tcW w:type="dxa" w:w="4535"/>
-            <w:shd w:val="clear" w:color="auto" w:fill="F8FAFC"/>
-            <w:tcBorders>
-              <w:top w:val="single" w:sz="4" w:color="E2E8F0"/>
-              <w:left w:val="single" w:sz="4" w:color="E2E8F0"/>
-              <w:bottom w:val="single" w:sz="4" w:color="E2E8F0"/>
-              <w:right w:val="single" w:sz="4" w:color="E2E8F0"/>
-              <w:insideH w:val="single" w:sz="4" w:color="E2E8F0"/>
-              <w:insideV w:val="single" w:sz="4" w:color="E2E8F0"/>
-            </w:tcBorders>
-          </w:tcPr>
-          <w:p>
-            <w:r>
-              <w:rPr>
-                <w:color w:val="1E293B"/>
-                <w:sz w:val="18"/>
-              </w:rPr>
-              <w:t>Цвет текста кнопки</w:t>
-            </w:r>
-          </w:p>
-        </w:tc>
-      </w:tr>
-      <w:tr>
-        <w:tc>
-          <w:tcPr>
-            <w:tcW w:type="dxa" w:w="2551"/>
-            <w:shd w:val="clear" w:color="auto" w:fill="FFFFFF"/>
-            <w:tcBorders>
-              <w:top w:val="single" w:sz="4" w:color="E2E8F0"/>
-              <w:left w:val="single" w:sz="4" w:color="E2E8F0"/>
-              <w:bottom w:val="single" w:sz="4" w:color="E2E8F0"/>
-              <w:right w:val="single" w:sz="4" w:color="E2E8F0"/>
-              <w:insideH w:val="single" w:sz="4" w:color="E2E8F0"/>
-              <w:insideV w:val="single" w:sz="4" w:color="E2E8F0"/>
-            </w:tcBorders>
-          </w:tcPr>
-          <w:p>
-            <w:r>
-              <w:rPr>
-                <w:b/>
-                <w:color w:val="2D3A8C"/>
-                <w:sz w:val="18"/>
-              </w:rPr>
-              <w:t>btnRadius</w:t>
-            </w:r>
-          </w:p>
-        </w:tc>
-        <w:tc>
-          <w:tcPr>
-            <w:tcW w:type="dxa" w:w="1417"/>
-            <w:shd w:val="clear" w:color="auto" w:fill="FFFFFF"/>
-            <w:tcBorders>
-              <w:top w:val="single" w:sz="4" w:color="E2E8F0"/>
-              <w:left w:val="single" w:sz="4" w:color="E2E8F0"/>
-              <w:bottom w:val="single" w:sz="4" w:color="E2E8F0"/>
-              <w:right w:val="single" w:sz="4" w:color="E2E8F0"/>
-              <w:insideH w:val="single" w:sz="4" w:color="E2E8F0"/>
-              <w:insideV w:val="single" w:sz="4" w:color="E2E8F0"/>
-            </w:tcBorders>
-          </w:tcPr>
-          <w:p>
-            <w:r>
-              <w:rPr>
-                <w:color w:val="1E293B"/>
-                <w:sz w:val="18"/>
-              </w:rPr>
-              <w:t>Number</w:t>
-            </w:r>
-          </w:p>
-        </w:tc>
-        <w:tc>
-          <w:tcPr>
-            <w:tcW w:type="dxa" w:w="1984"/>
-            <w:shd w:val="clear" w:color="auto" w:fill="FFFFFF"/>
-            <w:tcBorders>
-              <w:top w:val="single" w:sz="4" w:color="E2E8F0"/>
-              <w:left w:val="single" w:sz="4" w:color="E2E8F0"/>
-              <w:bottom w:val="single" w:sz="4" w:color="E2E8F0"/>
-              <w:right w:val="single" w:sz="4" w:color="E2E8F0"/>
-              <w:insideH w:val="single" w:sz="4" w:color="E2E8F0"/>
-              <w:insideV w:val="single" w:sz="4" w:color="E2E8F0"/>
-            </w:tcBorders>
-          </w:tcPr>
-          <w:p>
-            <w:r>
-              <w:rPr>
-                <w:color w:val="1E293B"/>
-                <w:sz w:val="18"/>
-              </w:rPr>
-              <w:t>8</w:t>
-            </w:r>
-          </w:p>
-        </w:tc>
-        <w:tc>
-          <w:tcPr>
-            <w:tcW w:type="dxa" w:w="4535"/>
-            <w:shd w:val="clear" w:color="auto" w:fill="FFFFFF"/>
-            <w:tcBorders>
-              <w:top w:val="single" w:sz="4" w:color="E2E8F0"/>
-              <w:left w:val="single" w:sz="4" w:color="E2E8F0"/>
-              <w:bottom w:val="single" w:sz="4" w:color="E2E8F0"/>
-              <w:right w:val="single" w:sz="4" w:color="E2E8F0"/>
-              <w:insideH w:val="single" w:sz="4" w:color="E2E8F0"/>
-              <w:insideV w:val="single" w:sz="4" w:color="E2E8F0"/>
-            </w:tcBorders>
-          </w:tcPr>
-          <w:p>
-            <w:r>
-              <w:rPr>
-                <w:color w:val="1E293B"/>
-                <w:sz w:val="18"/>
-              </w:rPr>
-              <w:t>Скругление кнопки (px)</w:t>
-            </w:r>
-          </w:p>
-        </w:tc>
-      </w:tr>
-      <w:tr>
-        <w:tc>
-          <w:tcPr>
-            <w:tcW w:type="dxa" w:w="2551"/>
-            <w:shd w:val="clear" w:color="auto" w:fill="F8FAFC"/>
-            <w:tcBorders>
-              <w:top w:val="single" w:sz="4" w:color="E2E8F0"/>
-              <w:left w:val="single" w:sz="4" w:color="E2E8F0"/>
-              <w:bottom w:val="single" w:sz="4" w:color="E2E8F0"/>
-              <w:right w:val="single" w:sz="4" w:color="E2E8F0"/>
-              <w:insideH w:val="single" w:sz="4" w:color="E2E8F0"/>
-              <w:insideV w:val="single" w:sz="4" w:color="E2E8F0"/>
-            </w:tcBorders>
-          </w:tcPr>
-          <w:p>
-            <w:r>
-              <w:rPr>
-                <w:b/>
-                <w:color w:val="2D3A8C"/>
-                <w:sz w:val="18"/>
-              </w:rPr>
-              <w:t>btnFontSize</w:t>
-            </w:r>
-          </w:p>
-        </w:tc>
-        <w:tc>
-          <w:tcPr>
-            <w:tcW w:type="dxa" w:w="1417"/>
-            <w:shd w:val="clear" w:color="auto" w:fill="F8FAFC"/>
-            <w:tcBorders>
-              <w:top w:val="single" w:sz="4" w:color="E2E8F0"/>
-              <w:left w:val="single" w:sz="4" w:color="E2E8F0"/>
-              <w:bottom w:val="single" w:sz="4" w:color="E2E8F0"/>
-              <w:right w:val="single" w:sz="4" w:color="E2E8F0"/>
-              <w:insideH w:val="single" w:sz="4" w:color="E2E8F0"/>
-              <w:insideV w:val="single" w:sz="4" w:color="E2E8F0"/>
-            </w:tcBorders>
-          </w:tcPr>
-          <w:p>
-            <w:r>
-              <w:rPr>
-                <w:color w:val="1E293B"/>
-                <w:sz w:val="18"/>
-              </w:rPr>
-              <w:t>String</w:t>
-            </w:r>
-          </w:p>
-        </w:tc>
-        <w:tc>
-          <w:tcPr>
-            <w:tcW w:type="dxa" w:w="1984"/>
-            <w:shd w:val="clear" w:color="auto" w:fill="F8FAFC"/>
-            <w:tcBorders>
-              <w:top w:val="single" w:sz="4" w:color="E2E8F0"/>
-              <w:left w:val="single" w:sz="4" w:color="E2E8F0"/>
-              <w:bottom w:val="single" w:sz="4" w:color="E2E8F0"/>
-              <w:right w:val="single" w:sz="4" w:color="E2E8F0"/>
-              <w:insideH w:val="single" w:sz="4" w:color="E2E8F0"/>
-              <w:insideV w:val="single" w:sz="4" w:color="E2E8F0"/>
-            </w:tcBorders>
-          </w:tcPr>
-          <w:p>
-            <w:r>
-              <w:rPr>
-                <w:color w:val="1E293B"/>
-                <w:sz w:val="18"/>
-              </w:rPr>
-              <w:t>''</w:t>
-            </w:r>
-          </w:p>
-        </w:tc>
-        <w:tc>
-          <w:tcPr>
-            <w:tcW w:type="dxa" w:w="4535"/>
-            <w:shd w:val="clear" w:color="auto" w:fill="F8FAFC"/>
-            <w:tcBorders>
-              <w:top w:val="single" w:sz="4" w:color="E2E8F0"/>
-              <w:left w:val="single" w:sz="4" w:color="E2E8F0"/>
-              <w:bottom w:val="single" w:sz="4" w:color="E2E8F0"/>
-              <w:right w:val="single" w:sz="4" w:color="E2E8F0"/>
-              <w:insideH w:val="single" w:sz="4" w:color="E2E8F0"/>
-              <w:insideV w:val="single" w:sz="4" w:color="E2E8F0"/>
-            </w:tcBorders>
-          </w:tcPr>
-          <w:p>
-            <w:r>
-              <w:rPr>
-                <w:color w:val="1E293B"/>
-                <w:sz w:val="18"/>
-              </w:rPr>
-              <w:t>Размер шрифта кнопки</w:t>
-            </w:r>
-          </w:p>
-        </w:tc>
-      </w:tr>
-      <w:tr>
-        <w:tc>
-          <w:tcPr>
-            <w:tcW w:type="dxa" w:w="2551"/>
-            <w:shd w:val="clear" w:color="auto" w:fill="FFFFFF"/>
-            <w:tcBorders>
-              <w:top w:val="single" w:sz="4" w:color="E2E8F0"/>
-              <w:left w:val="single" w:sz="4" w:color="E2E8F0"/>
-              <w:bottom w:val="single" w:sz="4" w:color="E2E8F0"/>
-              <w:right w:val="single" w:sz="4" w:color="E2E8F0"/>
-              <w:insideH w:val="single" w:sz="4" w:color="E2E8F0"/>
-              <w:insideV w:val="single" w:sz="4" w:color="E2E8F0"/>
-            </w:tcBorders>
-          </w:tcPr>
-          <w:p>
-            <w:r>
-              <w:rPr>
-                <w:b/>
-                <w:color w:val="2D3A8C"/>
-                <w:sz w:val="18"/>
-              </w:rPr>
-              <w:t>btnFontWeight</w:t>
-            </w:r>
-          </w:p>
-        </w:tc>
-        <w:tc>
-          <w:tcPr>
-            <w:tcW w:type="dxa" w:w="1417"/>
-            <w:shd w:val="clear" w:color="auto" w:fill="FFFFFF"/>
-            <w:tcBorders>
-              <w:top w:val="single" w:sz="4" w:color="E2E8F0"/>
-              <w:left w:val="single" w:sz="4" w:color="E2E8F0"/>
-              <w:bottom w:val="single" w:sz="4" w:color="E2E8F0"/>
-              <w:right w:val="single" w:sz="4" w:color="E2E8F0"/>
-              <w:insideH w:val="single" w:sz="4" w:color="E2E8F0"/>
-              <w:insideV w:val="single" w:sz="4" w:color="E2E8F0"/>
-            </w:tcBorders>
-          </w:tcPr>
-          <w:p>
-            <w:r>
-              <w:rPr>
-                <w:color w:val="1E293B"/>
-                <w:sz w:val="18"/>
-              </w:rPr>
-              <w:t>String</w:t>
-            </w:r>
-          </w:p>
-        </w:tc>
-        <w:tc>
-          <w:tcPr>
-            <w:tcW w:type="dxa" w:w="1984"/>
-            <w:shd w:val="clear" w:color="auto" w:fill="FFFFFF"/>
-            <w:tcBorders>
-              <w:top w:val="single" w:sz="4" w:color="E2E8F0"/>
-              <w:left w:val="single" w:sz="4" w:color="E2E8F0"/>
-              <w:bottom w:val="single" w:sz="4" w:color="E2E8F0"/>
-              <w:right w:val="single" w:sz="4" w:color="E2E8F0"/>
-              <w:insideH w:val="single" w:sz="4" w:color="E2E8F0"/>
-              <w:insideV w:val="single" w:sz="4" w:color="E2E8F0"/>
-            </w:tcBorders>
-          </w:tcPr>
-          <w:p>
-            <w:r>
-              <w:rPr>
-                <w:color w:val="1E293B"/>
-                <w:sz w:val="18"/>
-              </w:rPr>
-              <w:t>''</w:t>
-            </w:r>
-          </w:p>
-        </w:tc>
-        <w:tc>
-          <w:tcPr>
-            <w:tcW w:type="dxa" w:w="4535"/>
-            <w:shd w:val="clear" w:color="auto" w:fill="FFFFFF"/>
-            <w:tcBorders>
-              <w:top w:val="single" w:sz="4" w:color="E2E8F0"/>
-              <w:left w:val="single" w:sz="4" w:color="E2E8F0"/>
-              <w:bottom w:val="single" w:sz="4" w:color="E2E8F0"/>
-              <w:right w:val="single" w:sz="4" w:color="E2E8F0"/>
-              <w:insideH w:val="single" w:sz="4" w:color="E2E8F0"/>
-              <w:insideV w:val="single" w:sz="4" w:color="E2E8F0"/>
-            </w:tcBorders>
-          </w:tcPr>
-          <w:p>
-            <w:r>
-              <w:rPr>
-                <w:color w:val="1E293B"/>
-                <w:sz w:val="18"/>
-              </w:rPr>
-              <w:t>Толщина шрифта кнопки</w:t>
-            </w:r>
-          </w:p>
-        </w:tc>
-      </w:tr>
-      <w:tr>
-        <w:tc>
-          <w:tcPr>
-            <w:tcW w:type="dxa" w:w="2551"/>
-            <w:shd w:val="clear" w:color="auto" w:fill="F8FAFC"/>
-            <w:tcBorders>
-              <w:top w:val="single" w:sz="4" w:color="E2E8F0"/>
-              <w:left w:val="single" w:sz="4" w:color="E2E8F0"/>
-              <w:bottom w:val="single" w:sz="4" w:color="E2E8F0"/>
-              <w:right w:val="single" w:sz="4" w:color="E2E8F0"/>
-              <w:insideH w:val="single" w:sz="4" w:color="E2E8F0"/>
-              <w:insideV w:val="single" w:sz="4" w:color="E2E8F0"/>
-            </w:tcBorders>
-          </w:tcPr>
-          <w:p>
-            <w:r>
-              <w:rPr>
-                <w:b/>
-                <w:color w:val="2D3A8C"/>
-                <w:sz w:val="18"/>
-              </w:rPr>
-              <w:t>textTransform</w:t>
-            </w:r>
-          </w:p>
-        </w:tc>
-        <w:tc>
-          <w:tcPr>
-            <w:tcW w:type="dxa" w:w="1417"/>
-            <w:shd w:val="clear" w:color="auto" w:fill="F8FAFC"/>
-            <w:tcBorders>
-              <w:top w:val="single" w:sz="4" w:color="E2E8F0"/>
-              <w:left w:val="single" w:sz="4" w:color="E2E8F0"/>
-              <w:bottom w:val="single" w:sz="4" w:color="E2E8F0"/>
-              <w:right w:val="single" w:sz="4" w:color="E2E8F0"/>
-              <w:insideH w:val="single" w:sz="4" w:color="E2E8F0"/>
-              <w:insideV w:val="single" w:sz="4" w:color="E2E8F0"/>
-            </w:tcBorders>
-          </w:tcPr>
-          <w:p>
-            <w:r>
-              <w:rPr>
-                <w:color w:val="1E293B"/>
-                <w:sz w:val="18"/>
-              </w:rPr>
-              <w:t>String</w:t>
-            </w:r>
-          </w:p>
-        </w:tc>
-        <w:tc>
-          <w:tcPr>
-            <w:tcW w:type="dxa" w:w="1984"/>
-            <w:shd w:val="clear" w:color="auto" w:fill="F8FAFC"/>
-            <w:tcBorders>
-              <w:top w:val="single" w:sz="4" w:color="E2E8F0"/>
-              <w:left w:val="single" w:sz="4" w:color="E2E8F0"/>
-              <w:bottom w:val="single" w:sz="4" w:color="E2E8F0"/>
-              <w:right w:val="single" w:sz="4" w:color="E2E8F0"/>
-              <w:insideH w:val="single" w:sz="4" w:color="E2E8F0"/>
-              <w:insideV w:val="single" w:sz="4" w:color="E2E8F0"/>
-            </w:tcBorders>
-          </w:tcPr>
-          <w:p>
-            <w:r>
-              <w:rPr>
-                <w:color w:val="1E293B"/>
-                <w:sz w:val="18"/>
-              </w:rPr>
-              <w:t>none</w:t>
-            </w:r>
-          </w:p>
-        </w:tc>
-        <w:tc>
-          <w:tcPr>
-            <w:tcW w:type="dxa" w:w="4535"/>
-            <w:shd w:val="clear" w:color="auto" w:fill="F8FAFC"/>
-            <w:tcBorders>
-              <w:top w:val="single" w:sz="4" w:color="E2E8F0"/>
-              <w:left w:val="single" w:sz="4" w:color="E2E8F0"/>
-              <w:bottom w:val="single" w:sz="4" w:color="E2E8F0"/>
-              <w:right w:val="single" w:sz="4" w:color="E2E8F0"/>
-              <w:insideH w:val="single" w:sz="4" w:color="E2E8F0"/>
-              <w:insideV w:val="single" w:sz="4" w:color="E2E8F0"/>
-            </w:tcBorders>
-          </w:tcPr>
-          <w:p>
-            <w:r>
-              <w:rPr>
-                <w:color w:val="1E293B"/>
-                <w:sz w:val="18"/>
-              </w:rPr>
-              <w:t>Трансформация текста кнопки</w:t>
-            </w:r>
-          </w:p>
-        </w:tc>
-      </w:tr>
-      <w:tr>
-        <w:tc>
-          <w:tcPr>
-            <w:tcW w:type="dxa" w:w="2551"/>
-            <w:shd w:val="clear" w:color="auto" w:fill="FFFFFF"/>
-            <w:tcBorders>
-              <w:top w:val="single" w:sz="4" w:color="E2E8F0"/>
-              <w:left w:val="single" w:sz="4" w:color="E2E8F0"/>
-              <w:bottom w:val="single" w:sz="4" w:color="E2E8F0"/>
-              <w:right w:val="single" w:sz="4" w:color="E2E8F0"/>
-              <w:insideH w:val="single" w:sz="4" w:color="E2E8F0"/>
-              <w:insideV w:val="single" w:sz="4" w:color="E2E8F0"/>
-            </w:tcBorders>
-          </w:tcPr>
-          <w:p>
-            <w:r>
-              <w:rPr>
-                <w:b/>
-                <w:color w:val="2D3A8C"/>
-                <w:sz w:val="18"/>
-              </w:rPr>
-              <w:t>letterSpacing</w:t>
-            </w:r>
-          </w:p>
-        </w:tc>
-        <w:tc>
-          <w:tcPr>
-            <w:tcW w:type="dxa" w:w="1417"/>
-            <w:shd w:val="clear" w:color="auto" w:fill="FFFFFF"/>
-            <w:tcBorders>
-              <w:top w:val="single" w:sz="4" w:color="E2E8F0"/>
-              <w:left w:val="single" w:sz="4" w:color="E2E8F0"/>
-              <w:bottom w:val="single" w:sz="4" w:color="E2E8F0"/>
-              <w:right w:val="single" w:sz="4" w:color="E2E8F0"/>
-              <w:insideH w:val="single" w:sz="4" w:color="E2E8F0"/>
-              <w:insideV w:val="single" w:sz="4" w:color="E2E8F0"/>
-            </w:tcBorders>
-          </w:tcPr>
-          <w:p>
-            <w:r>
-              <w:rPr>
-                <w:color w:val="1E293B"/>
-                <w:sz w:val="18"/>
-              </w:rPr>
-              <w:t>String</w:t>
-            </w:r>
-          </w:p>
-        </w:tc>
-        <w:tc>
-          <w:tcPr>
-            <w:tcW w:type="dxa" w:w="1984"/>
-            <w:shd w:val="clear" w:color="auto" w:fill="FFFFFF"/>
-            <w:tcBorders>
-              <w:top w:val="single" w:sz="4" w:color="E2E8F0"/>
-              <w:left w:val="single" w:sz="4" w:color="E2E8F0"/>
-              <w:bottom w:val="single" w:sz="4" w:color="E2E8F0"/>
-              <w:right w:val="single" w:sz="4" w:color="E2E8F0"/>
-              <w:insideH w:val="single" w:sz="4" w:color="E2E8F0"/>
-              <w:insideV w:val="single" w:sz="4" w:color="E2E8F0"/>
-            </w:tcBorders>
-          </w:tcPr>
-          <w:p>
-            <w:r>
-              <w:rPr>
-                <w:color w:val="1E293B"/>
-                <w:sz w:val="18"/>
-              </w:rPr>
-              <w:t>''</w:t>
-            </w:r>
-          </w:p>
-        </w:tc>
-        <w:tc>
-          <w:tcPr>
-            <w:tcW w:type="dxa" w:w="4535"/>
-            <w:shd w:val="clear" w:color="auto" w:fill="FFFFFF"/>
-            <w:tcBorders>
-              <w:top w:val="single" w:sz="4" w:color="E2E8F0"/>
-              <w:left w:val="single" w:sz="4" w:color="E2E8F0"/>
-              <w:bottom w:val="single" w:sz="4" w:color="E2E8F0"/>
-              <w:right w:val="single" w:sz="4" w:color="E2E8F0"/>
-              <w:insideH w:val="single" w:sz="4" w:color="E2E8F0"/>
-              <w:insideV w:val="single" w:sz="4" w:color="E2E8F0"/>
-            </w:tcBorders>
-          </w:tcPr>
-          <w:p>
-            <w:r>
-              <w:rPr>
-                <w:color w:val="1E293B"/>
-                <w:sz w:val="18"/>
-              </w:rPr>
-              <w:t>Межбуквенный интервал кнопки</w:t>
-            </w:r>
-          </w:p>
-        </w:tc>
-      </w:tr>
-    </w:tbl>
-    <w:p/>
-    <w:p>
-      <w:r>
-        <w:rPr>
-          <w:b/>
-          <w:color w:val="1E293B"/>
-          <w:sz w:val="22"/>
-        </w:rPr>
-        <w:t>Произвольный CSS</w:t>
-      </w:r>
-    </w:p>
-    <w:tbl>
-      <w:tblPr>
-        <w:tblW w:type="auto" w:w="0"/>
-        <w:jc w:val="left"/>
-        <w:tblLook w:firstColumn="1" w:firstRow="1" w:lastColumn="0" w:lastRow="0" w:noHBand="0" w:noVBand="1" w:val="04A0"/>
-      </w:tblPr>
-      <w:tblGrid>
-        <w:gridCol w:w="2351"/>
-        <w:gridCol w:w="2351"/>
-        <w:gridCol w:w="2351"/>
-        <w:gridCol w:w="2351"/>
-      </w:tblGrid>
-      <w:tr>
-        <w:tc>
-          <w:tcPr>
-            <w:tcW w:type="dxa" w:w="2551"/>
-            <w:shd w:val="clear" w:color="auto" w:fill="4F6AFF"/>
-            <w:tcBorders>
-              <w:top w:val="single" w:sz="4" w:color="3A56F0"/>
-              <w:left w:val="single" w:sz="4" w:color="3A56F0"/>
-              <w:bottom w:val="single" w:sz="4" w:color="3A56F0"/>
-              <w:right w:val="single" w:sz="4" w:color="3A56F0"/>
-              <w:insideH w:val="single" w:sz="4" w:color="3A56F0"/>
-              <w:insideV w:val="single" w:sz="4" w:color="3A56F0"/>
-            </w:tcBorders>
-          </w:tcPr>
-          <w:p>
-            <w:pPr>
-              <w:jc w:val="left"/>
-            </w:pPr>
-            <w:r>
-              <w:rPr>
-                <w:b/>
-                <w:color w:val="FFFFFF"/>
-                <w:sz w:val="18"/>
-              </w:rPr>
-              <w:t>Параметр</w:t>
-            </w:r>
-          </w:p>
-        </w:tc>
-        <w:tc>
-          <w:tcPr>
-            <w:tcW w:type="dxa" w:w="1417"/>
-            <w:shd w:val="clear" w:color="auto" w:fill="4F6AFF"/>
-            <w:tcBorders>
-              <w:top w:val="single" w:sz="4" w:color="3A56F0"/>
-              <w:left w:val="single" w:sz="4" w:color="3A56F0"/>
-              <w:bottom w:val="single" w:sz="4" w:color="3A56F0"/>
-              <w:right w:val="single" w:sz="4" w:color="3A56F0"/>
-              <w:insideH w:val="single" w:sz="4" w:color="3A56F0"/>
-              <w:insideV w:val="single" w:sz="4" w:color="3A56F0"/>
-            </w:tcBorders>
-          </w:tcPr>
-          <w:p>
-            <w:pPr>
-              <w:jc w:val="left"/>
-            </w:pPr>
-            <w:r>
-              <w:rPr>
-                <w:b/>
-                <w:color w:val="FFFFFF"/>
-                <w:sz w:val="18"/>
-              </w:rPr>
-              <w:t>Тип</w:t>
-            </w:r>
-          </w:p>
-        </w:tc>
-        <w:tc>
-          <w:tcPr>
-            <w:tcW w:type="dxa" w:w="1984"/>
-            <w:shd w:val="clear" w:color="auto" w:fill="4F6AFF"/>
-            <w:tcBorders>
-              <w:top w:val="single" w:sz="4" w:color="3A56F0"/>
-              <w:left w:val="single" w:sz="4" w:color="3A56F0"/>
-              <w:bottom w:val="single" w:sz="4" w:color="3A56F0"/>
-              <w:right w:val="single" w:sz="4" w:color="3A56F0"/>
-              <w:insideH w:val="single" w:sz="4" w:color="3A56F0"/>
-              <w:insideV w:val="single" w:sz="4" w:color="3A56F0"/>
-            </w:tcBorders>
-          </w:tcPr>
-          <w:p>
-            <w:pPr>
-              <w:jc w:val="left"/>
-            </w:pPr>
-            <w:r>
-              <w:rPr>
-                <w:b/>
-                <w:color w:val="FFFFFF"/>
-                <w:sz w:val="18"/>
-              </w:rPr>
-              <w:t>Умолчание</w:t>
-            </w:r>
-          </w:p>
-        </w:tc>
-        <w:tc>
-          <w:tcPr>
-            <w:tcW w:type="dxa" w:w="4535"/>
-            <w:shd w:val="clear" w:color="auto" w:fill="4F6AFF"/>
-            <w:tcBorders>
-              <w:top w:val="single" w:sz="4" w:color="3A56F0"/>
-              <w:left w:val="single" w:sz="4" w:color="3A56F0"/>
-              <w:bottom w:val="single" w:sz="4" w:color="3A56F0"/>
-              <w:right w:val="single" w:sz="4" w:color="3A56F0"/>
-              <w:insideH w:val="single" w:sz="4" w:color="3A56F0"/>
-              <w:insideV w:val="single" w:sz="4" w:color="3A56F0"/>
-            </w:tcBorders>
-          </w:tcPr>
-          <w:p>
-            <w:pPr>
-              <w:jc w:val="left"/>
-            </w:pPr>
-            <w:r>
-              <w:rPr>
-                <w:b/>
-                <w:color w:val="FFFFFF"/>
-                <w:sz w:val="18"/>
-              </w:rPr>
-              <w:t>Описание</w:t>
-            </w:r>
-          </w:p>
-        </w:tc>
-      </w:tr>
-      <w:tr>
-        <w:tc>
-          <w:tcPr>
-            <w:tcW w:type="dxa" w:w="2551"/>
-            <w:shd w:val="clear" w:color="auto" w:fill="FFFFFF"/>
-            <w:tcBorders>
-              <w:top w:val="single" w:sz="4" w:color="E2E8F0"/>
-              <w:left w:val="single" w:sz="4" w:color="E2E8F0"/>
-              <w:bottom w:val="single" w:sz="4" w:color="E2E8F0"/>
-              <w:right w:val="single" w:sz="4" w:color="E2E8F0"/>
-              <w:insideH w:val="single" w:sz="4" w:color="E2E8F0"/>
-              <w:insideV w:val="single" w:sz="4" w:color="E2E8F0"/>
-            </w:tcBorders>
-          </w:tcPr>
-          <w:p>
-            <w:r>
-              <w:rPr>
-                <w:b/>
-                <w:color w:val="2D3A8C"/>
-                <w:sz w:val="18"/>
-              </w:rPr>
-              <w:t>overlayCustomCss</w:t>
-            </w:r>
-          </w:p>
-        </w:tc>
-        <w:tc>
-          <w:tcPr>
-            <w:tcW w:type="dxa" w:w="1417"/>
-            <w:shd w:val="clear" w:color="auto" w:fill="FFFFFF"/>
-            <w:tcBorders>
-              <w:top w:val="single" w:sz="4" w:color="E2E8F0"/>
-              <w:left w:val="single" w:sz="4" w:color="E2E8F0"/>
-              <w:bottom w:val="single" w:sz="4" w:color="E2E8F0"/>
-              <w:right w:val="single" w:sz="4" w:color="E2E8F0"/>
-              <w:insideH w:val="single" w:sz="4" w:color="E2E8F0"/>
-              <w:insideV w:val="single" w:sz="4" w:color="E2E8F0"/>
-            </w:tcBorders>
-          </w:tcPr>
-          <w:p>
-            <w:r>
-              <w:rPr>
-                <w:color w:val="1E293B"/>
-                <w:sz w:val="18"/>
-              </w:rPr>
-              <w:t>String</w:t>
-            </w:r>
-          </w:p>
-        </w:tc>
-        <w:tc>
-          <w:tcPr>
-            <w:tcW w:type="dxa" w:w="1984"/>
-            <w:shd w:val="clear" w:color="auto" w:fill="FFFFFF"/>
-            <w:tcBorders>
-              <w:top w:val="single" w:sz="4" w:color="E2E8F0"/>
-              <w:left w:val="single" w:sz="4" w:color="E2E8F0"/>
-              <w:bottom w:val="single" w:sz="4" w:color="E2E8F0"/>
-              <w:right w:val="single" w:sz="4" w:color="E2E8F0"/>
-              <w:insideH w:val="single" w:sz="4" w:color="E2E8F0"/>
-              <w:insideV w:val="single" w:sz="4" w:color="E2E8F0"/>
-            </w:tcBorders>
-          </w:tcPr>
-          <w:p>
-            <w:r>
-              <w:rPr>
-                <w:color w:val="1E293B"/>
-                <w:sz w:val="18"/>
-              </w:rPr>
-              <w:t>''</w:t>
-            </w:r>
-          </w:p>
-        </w:tc>
-        <w:tc>
-          <w:tcPr>
-            <w:tcW w:type="dxa" w:w="4535"/>
-            <w:shd w:val="clear" w:color="auto" w:fill="FFFFFF"/>
-            <w:tcBorders>
-              <w:top w:val="single" w:sz="4" w:color="E2E8F0"/>
-              <w:left w:val="single" w:sz="4" w:color="E2E8F0"/>
-              <w:bottom w:val="single" w:sz="4" w:color="E2E8F0"/>
-              <w:right w:val="single" w:sz="4" w:color="E2E8F0"/>
-              <w:insideH w:val="single" w:sz="4" w:color="E2E8F0"/>
-              <w:insideV w:val="single" w:sz="4" w:color="E2E8F0"/>
-            </w:tcBorders>
-          </w:tcPr>
-          <w:p>
-            <w:r>
-              <w:rPr>
-                <w:color w:val="1E293B"/>
-                <w:sz w:val="18"/>
-              </w:rPr>
-              <w:t>CSS для подложки</w:t>
-            </w:r>
-          </w:p>
-        </w:tc>
-      </w:tr>
-      <w:tr>
-        <w:tc>
-          <w:tcPr>
-            <w:tcW w:type="dxa" w:w="2551"/>
-            <w:shd w:val="clear" w:color="auto" w:fill="F8FAFC"/>
-            <w:tcBorders>
-              <w:top w:val="single" w:sz="4" w:color="E2E8F0"/>
-              <w:left w:val="single" w:sz="4" w:color="E2E8F0"/>
-              <w:bottom w:val="single" w:sz="4" w:color="E2E8F0"/>
-              <w:right w:val="single" w:sz="4" w:color="E2E8F0"/>
-              <w:insideH w:val="single" w:sz="4" w:color="E2E8F0"/>
-              <w:insideV w:val="single" w:sz="4" w:color="E2E8F0"/>
-            </w:tcBorders>
-          </w:tcPr>
-          <w:p>
-            <w:r>
-              <w:rPr>
-                <w:b/>
-                <w:color w:val="2D3A8C"/>
-                <w:sz w:val="18"/>
-              </w:rPr>
-              <w:t>dialogCustomCss</w:t>
-            </w:r>
-          </w:p>
-        </w:tc>
-        <w:tc>
-          <w:tcPr>
-            <w:tcW w:type="dxa" w:w="1417"/>
-            <w:shd w:val="clear" w:color="auto" w:fill="F8FAFC"/>
-            <w:tcBorders>
-              <w:top w:val="single" w:sz="4" w:color="E2E8F0"/>
-              <w:left w:val="single" w:sz="4" w:color="E2E8F0"/>
-              <w:bottom w:val="single" w:sz="4" w:color="E2E8F0"/>
-              <w:right w:val="single" w:sz="4" w:color="E2E8F0"/>
-              <w:insideH w:val="single" w:sz="4" w:color="E2E8F0"/>
-              <w:insideV w:val="single" w:sz="4" w:color="E2E8F0"/>
-            </w:tcBorders>
-          </w:tcPr>
-          <w:p>
-            <w:r>
-              <w:rPr>
-                <w:color w:val="1E293B"/>
-                <w:sz w:val="18"/>
-              </w:rPr>
-              <w:t>String</w:t>
-            </w:r>
-          </w:p>
-        </w:tc>
-        <w:tc>
-          <w:tcPr>
-            <w:tcW w:type="dxa" w:w="1984"/>
-            <w:shd w:val="clear" w:color="auto" w:fill="F8FAFC"/>
-            <w:tcBorders>
-              <w:top w:val="single" w:sz="4" w:color="E2E8F0"/>
-              <w:left w:val="single" w:sz="4" w:color="E2E8F0"/>
-              <w:bottom w:val="single" w:sz="4" w:color="E2E8F0"/>
-              <w:right w:val="single" w:sz="4" w:color="E2E8F0"/>
-              <w:insideH w:val="single" w:sz="4" w:color="E2E8F0"/>
-              <w:insideV w:val="single" w:sz="4" w:color="E2E8F0"/>
-            </w:tcBorders>
-          </w:tcPr>
-          <w:p>
-            <w:r>
-              <w:rPr>
-                <w:color w:val="1E293B"/>
-                <w:sz w:val="18"/>
-              </w:rPr>
-              <w:t>''</w:t>
-            </w:r>
-          </w:p>
-        </w:tc>
-        <w:tc>
-          <w:tcPr>
-            <w:tcW w:type="dxa" w:w="4535"/>
-            <w:shd w:val="clear" w:color="auto" w:fill="F8FAFC"/>
-            <w:tcBorders>
-              <w:top w:val="single" w:sz="4" w:color="E2E8F0"/>
-              <w:left w:val="single" w:sz="4" w:color="E2E8F0"/>
-              <w:bottom w:val="single" w:sz="4" w:color="E2E8F0"/>
-              <w:right w:val="single" w:sz="4" w:color="E2E8F0"/>
-              <w:insideH w:val="single" w:sz="4" w:color="E2E8F0"/>
-              <w:insideV w:val="single" w:sz="4" w:color="E2E8F0"/>
-            </w:tcBorders>
-          </w:tcPr>
-          <w:p>
-            <w:r>
-              <w:rPr>
-                <w:color w:val="1E293B"/>
-                <w:sz w:val="18"/>
-              </w:rPr>
-              <w:t>CSS для диалогового окна</w:t>
-            </w:r>
-          </w:p>
-        </w:tc>
-      </w:tr>
-      <w:tr>
-        <w:tc>
-          <w:tcPr>
-            <w:tcW w:type="dxa" w:w="2551"/>
-            <w:shd w:val="clear" w:color="auto" w:fill="FFFFFF"/>
-            <w:tcBorders>
-              <w:top w:val="single" w:sz="4" w:color="E2E8F0"/>
-              <w:left w:val="single" w:sz="4" w:color="E2E8F0"/>
-              <w:bottom w:val="single" w:sz="4" w:color="E2E8F0"/>
-              <w:right w:val="single" w:sz="4" w:color="E2E8F0"/>
-              <w:insideH w:val="single" w:sz="4" w:color="E2E8F0"/>
-              <w:insideV w:val="single" w:sz="4" w:color="E2E8F0"/>
-            </w:tcBorders>
-          </w:tcPr>
-          <w:p>
-            <w:r>
-              <w:rPr>
-                <w:b/>
-                <w:color w:val="2D3A8C"/>
-                <w:sz w:val="18"/>
-              </w:rPr>
-              <w:t>dialogBtnCustomCss</w:t>
-            </w:r>
-          </w:p>
-        </w:tc>
-        <w:tc>
-          <w:tcPr>
-            <w:tcW w:type="dxa" w:w="1417"/>
-            <w:shd w:val="clear" w:color="auto" w:fill="FFFFFF"/>
-            <w:tcBorders>
-              <w:top w:val="single" w:sz="4" w:color="E2E8F0"/>
-              <w:left w:val="single" w:sz="4" w:color="E2E8F0"/>
-              <w:bottom w:val="single" w:sz="4" w:color="E2E8F0"/>
-              <w:right w:val="single" w:sz="4" w:color="E2E8F0"/>
-              <w:insideH w:val="single" w:sz="4" w:color="E2E8F0"/>
-              <w:insideV w:val="single" w:sz="4" w:color="E2E8F0"/>
-            </w:tcBorders>
-          </w:tcPr>
-          <w:p>
-            <w:r>
-              <w:rPr>
-                <w:color w:val="1E293B"/>
-                <w:sz w:val="18"/>
-              </w:rPr>
-              <w:t>String</w:t>
-            </w:r>
-          </w:p>
-        </w:tc>
-        <w:tc>
-          <w:tcPr>
-            <w:tcW w:type="dxa" w:w="1984"/>
-            <w:shd w:val="clear" w:color="auto" w:fill="FFFFFF"/>
-            <w:tcBorders>
-              <w:top w:val="single" w:sz="4" w:color="E2E8F0"/>
-              <w:left w:val="single" w:sz="4" w:color="E2E8F0"/>
-              <w:bottom w:val="single" w:sz="4" w:color="E2E8F0"/>
-              <w:right w:val="single" w:sz="4" w:color="E2E8F0"/>
-              <w:insideH w:val="single" w:sz="4" w:color="E2E8F0"/>
-              <w:insideV w:val="single" w:sz="4" w:color="E2E8F0"/>
-            </w:tcBorders>
-          </w:tcPr>
-          <w:p>
-            <w:r>
-              <w:rPr>
-                <w:color w:val="1E293B"/>
-                <w:sz w:val="18"/>
-              </w:rPr>
-              <w:t>''</w:t>
-            </w:r>
-          </w:p>
-        </w:tc>
-        <w:tc>
-          <w:tcPr>
-            <w:tcW w:type="dxa" w:w="4535"/>
-            <w:shd w:val="clear" w:color="auto" w:fill="FFFFFF"/>
-            <w:tcBorders>
-              <w:top w:val="single" w:sz="4" w:color="E2E8F0"/>
-              <w:left w:val="single" w:sz="4" w:color="E2E8F0"/>
-              <w:bottom w:val="single" w:sz="4" w:color="E2E8F0"/>
-              <w:right w:val="single" w:sz="4" w:color="E2E8F0"/>
-              <w:insideH w:val="single" w:sz="4" w:color="E2E8F0"/>
-              <w:insideV w:val="single" w:sz="4" w:color="E2E8F0"/>
-            </w:tcBorders>
-          </w:tcPr>
-          <w:p>
-            <w:r>
-              <w:rPr>
-                <w:color w:val="1E293B"/>
-                <w:sz w:val="18"/>
-              </w:rPr>
-              <w:t>CSS для кнопки в диалоге</w:t>
-            </w:r>
-          </w:p>
-        </w:tc>
-      </w:tr>
-    </w:tbl>
     <w:p/>
     <w:sectPr>
       <w:pgSz w:w="12240" w:h="15840"/>
@@ -3982,7 +927,7 @@
     <w:rPr>
       <w:rFonts w:ascii="Calibri" w:hAnsi="Calibri"/>
       <w:color w:val="1E293B"/>
-      <w:sz w:val="20"/>
+      <w:sz w:val="21"/>
     </w:rPr>
   </w:style>
   <w:style w:type="paragraph" w:styleId="Header">

</xml_diff>